<commit_message>
docs: refresh qualification documentation files
Update thesis and appendix DOCX files with improved versions while keeping file paths referenced in README unchanged.
</commit_message>
<xml_diff>
--- a/docs/Додатки.docx
+++ b/docs/Додатки.docx
@@ -33,6 +33,11 @@
     </w:p>
     <w:p>
       <w:r>
+        <w:t>Додаток Г. Публічний репозиторій вихідного коду вебзастосунку.</w:t>
+      </w:r>
+    </w:p>
+    <w:p>
+      <w:r>
         <w:t>Додаток Д. Інструкція запуску проєкту.</w:t>
       </w:r>
     </w:p>
@@ -75,18 +80,66 @@
       </w:r>
     </w:p>
     <w:p>
+      <w:pPr>
+        <w:ind w:firstLine="0"/>
+      </w:pPr>
       <w:r>
-        <w:t>Рис. А.1 - логічна взаємодія сутностей Category, Source, Term та UserSuggestion.</w:t>
+        <w:t>У додатку наведено логічну ER-діаграму словникової бази даних та стисле пояснення зв'язків між основними сутностями, що підтверджує проєктні рішення з розділу 2 без повторення повного тексту основної частини.</w:t>
       </w:r>
     </w:p>
     <w:p>
+      <w:pPr>
+        <w:jc w:val="center"/>
+      </w:pPr>
       <w:r>
-        <w:t>Category (1) -&gt; (N) Term; Source (1) -&gt; (N) Term.</w:t>
+        <w:drawing>
+          <wp:inline xmlns:a="http://schemas.openxmlformats.org/drawingml/2006/main" xmlns:pic="http://schemas.openxmlformats.org/drawingml/2006/picture">
+            <wp:extent cx="5580000" cy="4185000"/>
+            <wp:docPr id="1" name="Picture 1"/>
+            <wp:cNvGraphicFramePr>
+              <a:graphicFrameLocks noChangeAspect="1"/>
+            </wp:cNvGraphicFramePr>
+            <a:graphic>
+              <a:graphicData uri="http://schemas.openxmlformats.org/drawingml/2006/picture">
+                <pic:pic>
+                  <pic:nvPicPr>
+                    <pic:cNvPr id="0" name="fig1_er.png"/>
+                    <pic:cNvPicPr/>
+                  </pic:nvPicPr>
+                  <pic:blipFill>
+                    <a:blip r:embed="rId10"/>
+                    <a:stretch>
+                      <a:fillRect/>
+                    </a:stretch>
+                  </pic:blipFill>
+                  <pic:spPr>
+                    <a:xfrm>
+                      <a:off x="0" y="0"/>
+                      <a:ext cx="5580000" cy="4185000"/>
+                    </a:xfrm>
+                    <a:prstGeom prst="rect"/>
+                  </pic:spPr>
+                </pic:pic>
+              </a:graphicData>
+            </a:graphic>
+          </wp:inline>
+        </w:drawing>
       </w:r>
     </w:p>
     <w:p>
+      <w:pPr>
+        <w:jc w:val="center"/>
+      </w:pPr>
       <w:r>
-        <w:t>Кожен термін має обов'язковий зв'язок із категорією і необов'язковий зв'язок із джерелом.</w:t>
+        <w:t>Рисунок А.1 - Логічна ER-структура сутностей словникової бази даних</w:t>
+      </w:r>
+    </w:p>
+    <w:p>
+      <w:pPr>
+        <w:ind w:firstLine="0"/>
+      </w:pPr>
+      <w:r>
+        <w:t>Зв'язки: Category (1) → (N) Term; Source (1) → (N) Term (необов'язково). Сутність UserSuggestion підтримує контур модерації пропозицій нових термінів і не входить у публічний каталог до перевірки адміністратором.</w:t>
       </w:r>
     </w:p>
     <w:p>
@@ -123,23 +176,66 @@
       </w:r>
     </w:p>
     <w:p>
+      <w:pPr>
+        <w:ind w:firstLine="0"/>
+      </w:pPr>
       <w:r>
-        <w:t>Рис. Б.1 - маршрут «Головна -&gt; Каталог -&gt; Картка терміна».</w:t>
+        <w:t>У додатку подано схему навігації вебзастосунку, що узагальнює основні траєкторії переходів користувача між сторінками публічної частини системи.</w:t>
       </w:r>
     </w:p>
     <w:p>
+      <w:pPr>
+        <w:jc w:val="center"/>
+      </w:pPr>
       <w:r>
-        <w:t>Рис. Б.2 - маршрут «Головна -&gt; Категорії -&gt; Картка категорії».</w:t>
+        <w:drawing>
+          <wp:inline xmlns:a="http://schemas.openxmlformats.org/drawingml/2006/main" xmlns:pic="http://schemas.openxmlformats.org/drawingml/2006/picture">
+            <wp:extent cx="5580000" cy="4185000"/>
+            <wp:docPr id="2" name="Picture 2"/>
+            <wp:cNvGraphicFramePr>
+              <a:graphicFrameLocks noChangeAspect="1"/>
+            </wp:cNvGraphicFramePr>
+            <a:graphic>
+              <a:graphicData uri="http://schemas.openxmlformats.org/drawingml/2006/picture">
+                <pic:pic>
+                  <pic:nvPicPr>
+                    <pic:cNvPr id="0" name="fig3_nav.png"/>
+                    <pic:cNvPicPr/>
+                  </pic:nvPicPr>
+                  <pic:blipFill>
+                    <a:blip r:embed="rId11"/>
+                    <a:stretch>
+                      <a:fillRect/>
+                    </a:stretch>
+                  </pic:blipFill>
+                  <pic:spPr>
+                    <a:xfrm>
+                      <a:off x="0" y="0"/>
+                      <a:ext cx="5580000" cy="4185000"/>
+                    </a:xfrm>
+                    <a:prstGeom prst="rect"/>
+                  </pic:spPr>
+                </pic:pic>
+              </a:graphicData>
+            </a:graphic>
+          </wp:inline>
+        </w:drawing>
       </w:r>
     </w:p>
     <w:p>
+      <w:pPr>
+        <w:jc w:val="center"/>
+      </w:pPr>
       <w:r>
-        <w:t>Рис. Б.3 - маршрут «Головна -&gt; Запропонувати термін».</w:t>
+        <w:t>Рисунок Б.1 - Карта екранних форм і маршрутів вебзастосунку</w:t>
       </w:r>
     </w:p>
     <w:p>
+      <w:pPr>
+        <w:ind w:firstLine="0"/>
+      </w:pPr>
       <w:r>
-        <w:t>Рис. Б.4 - структура взаємодії користувача з меню навігації.</w:t>
+        <w:t>Типові сценарії: (1) швидкий пошук і відкриття картки терміна з каталогу; (2) тематичний перегляд через категорії; (3) подання пропозиції нового терміна через форму зворотного зв'язку. Схема доповнює опис UX у розділі 3 візуальним підтвердженням.</w:t>
       </w:r>
     </w:p>
     <w:p>
@@ -172,47 +268,2440 @@
         <w:rPr>
           <w:b/>
         </w:rPr>
-        <w:t>ФРАГМЕНТИ КОДУ</w:t>
+        <w:t>КЛЮЧОВІ ФРАГМЕНТИ ПРОГРАМНОГО КОДУ ТА ІЛЮСТРАЦІЇ ІНТЕРФЕЙСУ</w:t>
       </w:r>
     </w:p>
     <w:p>
+      <w:pPr>
+        <w:ind w:firstLine="0"/>
+      </w:pPr>
       <w:r>
-        <w:t>Лістинг В.1 - моделі даних у файлі dictionary/models.py.</w:t>
+        <w:t>Додаток містить репрезентативні фрагменти програмного коду та скріншоти реалізованого інтерфейсу. Лістинги знято з актуальних файлів проєкту; ілюстрації відповідають екранним формам, наведеним у розділі 3.</w:t>
       </w:r>
     </w:p>
     <w:p>
+      <w:pPr>
+        <w:pStyle w:val="Heading2"/>
+        <w:keepNext w:val="0"/>
+        <w:pageBreakBefore w:val="0"/>
+        <w:jc w:val="left"/>
+      </w:pPr>
       <w:r>
-        <w:t>Лістинг В.2 - представлення у файлі dictionary/views.py.</w:t>
+        <w:rPr>
+          <w:b/>
+        </w:rPr>
+        <w:t>ФРАГМЕНТИ ПРОГРАМНОГО КОДУ</w:t>
       </w:r>
     </w:p>
     <w:p>
+      <w:pPr>
+        <w:spacing w:before="240" w:after="80"/>
+        <w:ind w:firstLine="0"/>
+      </w:pPr>
       <w:r>
-        <w:t>Лістинг В.3 - маршрути у файлі dictionary/urls.py.</w:t>
+        <w:rPr>
+          <w:b/>
+        </w:rPr>
+        <w:t>Моделі даних</w:t>
       </w:r>
     </w:p>
     <w:p>
+      <w:pPr>
+        <w:spacing w:before="200" w:after="20"/>
+        <w:ind w:firstLine="0"/>
+      </w:pPr>
       <w:r>
-        <w:t>Лістинг В.4 - реєстрація сутностей в адмін-панелі у dictionary/admin.py.</w:t>
+        <w:rPr>
+          <w:b/>
+        </w:rPr>
+        <w:t>Лістинг В.1 - Модель словникової статті Term</w:t>
       </w:r>
     </w:p>
     <w:p>
+      <w:pPr>
+        <w:spacing w:before="0" w:after="60"/>
+        <w:ind w:firstLine="0"/>
+      </w:pPr>
       <w:r>
-        <w:t>Рис. В.1 - скріншот головної сторінки (див. docs/figures/Рисунок 3.2 – Реалізована головна сторінка вебсловника.png).</w:t>
+        <w:rPr>
+          <w:i/>
+          <w:sz w:val="20"/>
+        </w:rPr>
+        <w:t>Файл: dictionary/models.py, рядки 37-69.</w:t>
       </w:r>
     </w:p>
     <w:p>
+      <w:pPr>
+        <w:widowControl/>
+        <w:spacing w:line="240" w:lineRule="auto" w:after="0" w:before="0"/>
+        <w:ind w:firstLine="0" w:left="198" w:right="113"/>
+        <w:shd w:val="clear" w:fill="F5F5F5" w:color="auto"/>
+        <w:pBdr>
+          <w:left w:val="single" w:sz="4" w:space="1" w:color="D9D9D9"/>
+          <w:right w:val="single" w:sz="4" w:space="1" w:color="D9D9D9"/>
+        </w:pBdr>
+      </w:pPr>
       <w:r>
-        <w:t>Рис. В.2 - скріншот каталогу термінів (див. docs/figures/Рисунок 3.3 – Реалізована сторінка каталогу термінів і пошуку.png).</w:t>
+        <w:rPr>
+          <w:rFonts w:ascii="Consolas" w:hAnsi="Consolas"/>
+          <w:sz w:val="17"/>
+        </w:rPr>
+        <w:t>class Term(models.Model):</w:t>
       </w:r>
     </w:p>
     <w:p>
+      <w:pPr>
+        <w:widowControl/>
+        <w:spacing w:line="240" w:lineRule="auto" w:after="0" w:before="0"/>
+        <w:ind w:firstLine="0" w:left="198" w:right="113"/>
+        <w:shd w:val="clear" w:fill="F5F5F5" w:color="auto"/>
+        <w:pBdr>
+          <w:left w:val="single" w:sz="4" w:space="1" w:color="D9D9D9"/>
+          <w:right w:val="single" w:sz="4" w:space="1" w:color="D9D9D9"/>
+        </w:pBdr>
+      </w:pPr>
       <w:r>
-        <w:t>Рис. В.3 - скріншот картки терміна (див. docs/figures/Рисунок 3.4 – Реалізована сторінка картки терміна.png).</w:t>
+        <w:rPr>
+          <w:rFonts w:ascii="Consolas" w:hAnsi="Consolas"/>
+          <w:sz w:val="17"/>
+        </w:rPr>
+        <w:t xml:space="preserve">    term = models.CharField(max_length=120, unique=True, db_index=True)</w:t>
       </w:r>
     </w:p>
     <w:p>
+      <w:pPr>
+        <w:widowControl/>
+        <w:spacing w:line="240" w:lineRule="auto" w:after="0" w:before="0"/>
+        <w:ind w:firstLine="0" w:left="198" w:right="113"/>
+        <w:shd w:val="clear" w:fill="F5F5F5" w:color="auto"/>
+        <w:pBdr>
+          <w:left w:val="single" w:sz="4" w:space="1" w:color="D9D9D9"/>
+          <w:right w:val="single" w:sz="4" w:space="1" w:color="D9D9D9"/>
+        </w:pBdr>
+      </w:pPr>
       <w:r>
-        <w:t>Рис. В.4 - скріншот контуру адмін-панелі (див. docs/figures/Рисунок 3.5 — контур админ-подсистемы.png).</w:t>
+        <w:rPr>
+          <w:rFonts w:ascii="Consolas" w:hAnsi="Consolas"/>
+          <w:sz w:val="17"/>
+        </w:rPr>
+        <w:t xml:space="preserve">    slug = models.SlugField(max_length=140, unique=True)</w:t>
+      </w:r>
+    </w:p>
+    <w:p>
+      <w:pPr>
+        <w:widowControl/>
+        <w:spacing w:line="240" w:lineRule="auto" w:after="0" w:before="0"/>
+        <w:ind w:firstLine="0" w:left="198" w:right="113"/>
+        <w:shd w:val="clear" w:fill="F5F5F5" w:color="auto"/>
+        <w:pBdr>
+          <w:left w:val="single" w:sz="4" w:space="1" w:color="D9D9D9"/>
+          <w:right w:val="single" w:sz="4" w:space="1" w:color="D9D9D9"/>
+        </w:pBdr>
+      </w:pPr>
+      <w:r>
+        <w:rPr>
+          <w:rFonts w:ascii="Consolas" w:hAnsi="Consolas"/>
+          <w:sz w:val="17"/>
+        </w:rPr>
+        <w:t xml:space="preserve">    short_definition = models.CharField(max_length=255)</w:t>
+      </w:r>
+    </w:p>
+    <w:p>
+      <w:pPr>
+        <w:widowControl/>
+        <w:spacing w:line="240" w:lineRule="auto" w:after="0" w:before="0"/>
+        <w:ind w:firstLine="0" w:left="198" w:right="113"/>
+        <w:shd w:val="clear" w:fill="F5F5F5" w:color="auto"/>
+        <w:pBdr>
+          <w:left w:val="single" w:sz="4" w:space="1" w:color="D9D9D9"/>
+          <w:right w:val="single" w:sz="4" w:space="1" w:color="D9D9D9"/>
+        </w:pBdr>
+      </w:pPr>
+      <w:r>
+        <w:rPr>
+          <w:rFonts w:ascii="Consolas" w:hAnsi="Consolas"/>
+          <w:sz w:val="17"/>
+        </w:rPr>
+        <w:t xml:space="preserve">    full_definition = models.TextField(validators=[MinLengthValidator(30)])</w:t>
+      </w:r>
+    </w:p>
+    <w:p>
+      <w:pPr>
+        <w:widowControl/>
+        <w:spacing w:line="240" w:lineRule="auto" w:after="0" w:before="0"/>
+        <w:ind w:firstLine="0" w:left="198" w:right="113"/>
+        <w:shd w:val="clear" w:fill="F5F5F5" w:color="auto"/>
+        <w:pBdr>
+          <w:left w:val="single" w:sz="4" w:space="1" w:color="D9D9D9"/>
+          <w:right w:val="single" w:sz="4" w:space="1" w:color="D9D9D9"/>
+        </w:pBdr>
+      </w:pPr>
+      <w:r>
+        <w:rPr>
+          <w:rFonts w:ascii="Consolas" w:hAnsi="Consolas"/>
+          <w:sz w:val="17"/>
+        </w:rPr>
+        <w:t xml:space="preserve">    category = models.ForeignKey(</w:t>
+      </w:r>
+    </w:p>
+    <w:p>
+      <w:pPr>
+        <w:widowControl/>
+        <w:spacing w:line="240" w:lineRule="auto" w:after="0" w:before="0"/>
+        <w:ind w:firstLine="0" w:left="198" w:right="113"/>
+        <w:shd w:val="clear" w:fill="F5F5F5" w:color="auto"/>
+        <w:pBdr>
+          <w:left w:val="single" w:sz="4" w:space="1" w:color="D9D9D9"/>
+          <w:right w:val="single" w:sz="4" w:space="1" w:color="D9D9D9"/>
+        </w:pBdr>
+      </w:pPr>
+      <w:r>
+        <w:rPr>
+          <w:rFonts w:ascii="Consolas" w:hAnsi="Consolas"/>
+          <w:sz w:val="17"/>
+        </w:rPr>
+        <w:t xml:space="preserve">        Category,</w:t>
+      </w:r>
+    </w:p>
+    <w:p>
+      <w:pPr>
+        <w:widowControl/>
+        <w:spacing w:line="240" w:lineRule="auto" w:after="0" w:before="0"/>
+        <w:ind w:firstLine="0" w:left="198" w:right="113"/>
+        <w:shd w:val="clear" w:fill="F5F5F5" w:color="auto"/>
+        <w:pBdr>
+          <w:left w:val="single" w:sz="4" w:space="1" w:color="D9D9D9"/>
+          <w:right w:val="single" w:sz="4" w:space="1" w:color="D9D9D9"/>
+        </w:pBdr>
+      </w:pPr>
+      <w:r>
+        <w:rPr>
+          <w:rFonts w:ascii="Consolas" w:hAnsi="Consolas"/>
+          <w:sz w:val="17"/>
+        </w:rPr>
+        <w:t xml:space="preserve">        on_delete=models.PROTECT,</w:t>
+      </w:r>
+    </w:p>
+    <w:p>
+      <w:pPr>
+        <w:widowControl/>
+        <w:spacing w:line="240" w:lineRule="auto" w:after="0" w:before="0"/>
+        <w:ind w:firstLine="0" w:left="198" w:right="113"/>
+        <w:shd w:val="clear" w:fill="F5F5F5" w:color="auto"/>
+        <w:pBdr>
+          <w:left w:val="single" w:sz="4" w:space="1" w:color="D9D9D9"/>
+          <w:right w:val="single" w:sz="4" w:space="1" w:color="D9D9D9"/>
+        </w:pBdr>
+      </w:pPr>
+      <w:r>
+        <w:rPr>
+          <w:rFonts w:ascii="Consolas" w:hAnsi="Consolas"/>
+          <w:sz w:val="17"/>
+        </w:rPr>
+        <w:t xml:space="preserve">        related_name="terms",</w:t>
+      </w:r>
+    </w:p>
+    <w:p>
+      <w:pPr>
+        <w:widowControl/>
+        <w:spacing w:line="240" w:lineRule="auto" w:after="0" w:before="0"/>
+        <w:ind w:firstLine="0" w:left="198" w:right="113"/>
+        <w:shd w:val="clear" w:fill="F5F5F5" w:color="auto"/>
+        <w:pBdr>
+          <w:left w:val="single" w:sz="4" w:space="1" w:color="D9D9D9"/>
+          <w:right w:val="single" w:sz="4" w:space="1" w:color="D9D9D9"/>
+        </w:pBdr>
+      </w:pPr>
+      <w:r>
+        <w:rPr>
+          <w:rFonts w:ascii="Consolas" w:hAnsi="Consolas"/>
+          <w:sz w:val="17"/>
+        </w:rPr>
+        <w:t xml:space="preserve">    )</w:t>
+      </w:r>
+    </w:p>
+    <w:p>
+      <w:pPr>
+        <w:widowControl/>
+        <w:spacing w:line="240" w:lineRule="auto" w:after="0" w:before="0"/>
+        <w:ind w:firstLine="0" w:left="198" w:right="113"/>
+        <w:shd w:val="clear" w:fill="F5F5F5" w:color="auto"/>
+        <w:pBdr>
+          <w:left w:val="single" w:sz="4" w:space="1" w:color="D9D9D9"/>
+          <w:right w:val="single" w:sz="4" w:space="1" w:color="D9D9D9"/>
+        </w:pBdr>
+      </w:pPr>
+      <w:r>
+        <w:rPr>
+          <w:rFonts w:ascii="Consolas" w:hAnsi="Consolas"/>
+          <w:sz w:val="17"/>
+        </w:rPr>
+        <w:t xml:space="preserve">    source = models.ForeignKey(</w:t>
+      </w:r>
+    </w:p>
+    <w:p>
+      <w:pPr>
+        <w:widowControl/>
+        <w:spacing w:line="240" w:lineRule="auto" w:after="0" w:before="0"/>
+        <w:ind w:firstLine="0" w:left="198" w:right="113"/>
+        <w:shd w:val="clear" w:fill="F5F5F5" w:color="auto"/>
+        <w:pBdr>
+          <w:left w:val="single" w:sz="4" w:space="1" w:color="D9D9D9"/>
+          <w:right w:val="single" w:sz="4" w:space="1" w:color="D9D9D9"/>
+        </w:pBdr>
+      </w:pPr>
+      <w:r>
+        <w:rPr>
+          <w:rFonts w:ascii="Consolas" w:hAnsi="Consolas"/>
+          <w:sz w:val="17"/>
+        </w:rPr>
+        <w:t xml:space="preserve">        Source,</w:t>
+      </w:r>
+    </w:p>
+    <w:p>
+      <w:pPr>
+        <w:widowControl/>
+        <w:spacing w:line="240" w:lineRule="auto" w:after="0" w:before="0"/>
+        <w:ind w:firstLine="0" w:left="198" w:right="113"/>
+        <w:shd w:val="clear" w:fill="F5F5F5" w:color="auto"/>
+        <w:pBdr>
+          <w:left w:val="single" w:sz="4" w:space="1" w:color="D9D9D9"/>
+          <w:right w:val="single" w:sz="4" w:space="1" w:color="D9D9D9"/>
+        </w:pBdr>
+      </w:pPr>
+      <w:r>
+        <w:rPr>
+          <w:rFonts w:ascii="Consolas" w:hAnsi="Consolas"/>
+          <w:sz w:val="17"/>
+        </w:rPr>
+        <w:t xml:space="preserve">        on_delete=models.SET_NULL,</w:t>
+      </w:r>
+    </w:p>
+    <w:p>
+      <w:pPr>
+        <w:widowControl/>
+        <w:spacing w:line="240" w:lineRule="auto" w:after="0" w:before="0"/>
+        <w:ind w:firstLine="0" w:left="198" w:right="113"/>
+        <w:shd w:val="clear" w:fill="F5F5F5" w:color="auto"/>
+        <w:pBdr>
+          <w:left w:val="single" w:sz="4" w:space="1" w:color="D9D9D9"/>
+          <w:right w:val="single" w:sz="4" w:space="1" w:color="D9D9D9"/>
+        </w:pBdr>
+      </w:pPr>
+      <w:r>
+        <w:rPr>
+          <w:rFonts w:ascii="Consolas" w:hAnsi="Consolas"/>
+          <w:sz w:val="17"/>
+        </w:rPr>
+        <w:t xml:space="preserve">        null=True,</w:t>
+      </w:r>
+    </w:p>
+    <w:p>
+      <w:pPr>
+        <w:widowControl/>
+        <w:spacing w:line="240" w:lineRule="auto" w:after="0" w:before="0"/>
+        <w:ind w:firstLine="0" w:left="198" w:right="113"/>
+        <w:shd w:val="clear" w:fill="F5F5F5" w:color="auto"/>
+        <w:pBdr>
+          <w:left w:val="single" w:sz="4" w:space="1" w:color="D9D9D9"/>
+          <w:right w:val="single" w:sz="4" w:space="1" w:color="D9D9D9"/>
+        </w:pBdr>
+      </w:pPr>
+      <w:r>
+        <w:rPr>
+          <w:rFonts w:ascii="Consolas" w:hAnsi="Consolas"/>
+          <w:sz w:val="17"/>
+        </w:rPr>
+        <w:t xml:space="preserve">        blank=True,</w:t>
+      </w:r>
+    </w:p>
+    <w:p>
+      <w:pPr>
+        <w:widowControl/>
+        <w:spacing w:line="240" w:lineRule="auto" w:after="0" w:before="0"/>
+        <w:ind w:firstLine="0" w:left="198" w:right="113"/>
+        <w:shd w:val="clear" w:fill="F5F5F5" w:color="auto"/>
+        <w:pBdr>
+          <w:left w:val="single" w:sz="4" w:space="1" w:color="D9D9D9"/>
+          <w:right w:val="single" w:sz="4" w:space="1" w:color="D9D9D9"/>
+        </w:pBdr>
+      </w:pPr>
+      <w:r>
+        <w:rPr>
+          <w:rFonts w:ascii="Consolas" w:hAnsi="Consolas"/>
+          <w:sz w:val="17"/>
+        </w:rPr>
+        <w:t xml:space="preserve">        related_name="terms",</w:t>
+      </w:r>
+    </w:p>
+    <w:p>
+      <w:pPr>
+        <w:widowControl/>
+        <w:spacing w:line="240" w:lineRule="auto" w:after="0" w:before="0"/>
+        <w:ind w:firstLine="0" w:left="198" w:right="113"/>
+        <w:shd w:val="clear" w:fill="F5F5F5" w:color="auto"/>
+        <w:pBdr>
+          <w:left w:val="single" w:sz="4" w:space="1" w:color="D9D9D9"/>
+          <w:right w:val="single" w:sz="4" w:space="1" w:color="D9D9D9"/>
+        </w:pBdr>
+      </w:pPr>
+      <w:r>
+        <w:rPr>
+          <w:rFonts w:ascii="Consolas" w:hAnsi="Consolas"/>
+          <w:sz w:val="17"/>
+        </w:rPr>
+        <w:t xml:space="preserve">    )</w:t>
+      </w:r>
+    </w:p>
+    <w:p>
+      <w:pPr>
+        <w:widowControl/>
+        <w:spacing w:line="240" w:lineRule="auto" w:after="0" w:before="0"/>
+        <w:ind w:firstLine="0" w:left="198" w:right="113"/>
+        <w:shd w:val="clear" w:fill="F5F5F5" w:color="auto"/>
+        <w:pBdr>
+          <w:left w:val="single" w:sz="4" w:space="1" w:color="D9D9D9"/>
+          <w:right w:val="single" w:sz="4" w:space="1" w:color="D9D9D9"/>
+        </w:pBdr>
+      </w:pPr>
+      <w:r>
+        <w:rPr>
+          <w:rFonts w:ascii="Consolas" w:hAnsi="Consolas"/>
+          <w:sz w:val="17"/>
+        </w:rPr>
+        <w:t xml:space="preserve">    synonyms = models.CharField(max_length=255, blank=True)</w:t>
+      </w:r>
+    </w:p>
+    <w:p>
+      <w:pPr>
+        <w:widowControl/>
+        <w:spacing w:line="240" w:lineRule="auto" w:after="0" w:before="0"/>
+        <w:ind w:firstLine="0" w:left="198" w:right="113"/>
+        <w:shd w:val="clear" w:fill="F5F5F5" w:color="auto"/>
+        <w:pBdr>
+          <w:left w:val="single" w:sz="4" w:space="1" w:color="D9D9D9"/>
+          <w:right w:val="single" w:sz="4" w:space="1" w:color="D9D9D9"/>
+        </w:pBdr>
+      </w:pPr>
+      <w:r>
+        <w:rPr>
+          <w:rFonts w:ascii="Consolas" w:hAnsi="Consolas"/>
+          <w:sz w:val="17"/>
+        </w:rPr>
+        <w:t xml:space="preserve">    created_at = models.DateTimeField(auto_now_add=True)</w:t>
+      </w:r>
+    </w:p>
+    <w:p>
+      <w:pPr>
+        <w:widowControl/>
+        <w:spacing w:line="240" w:lineRule="auto" w:after="0" w:before="0"/>
+        <w:ind w:firstLine="0" w:left="198" w:right="113"/>
+        <w:shd w:val="clear" w:fill="F5F5F5" w:color="auto"/>
+        <w:pBdr>
+          <w:left w:val="single" w:sz="4" w:space="1" w:color="D9D9D9"/>
+          <w:right w:val="single" w:sz="4" w:space="1" w:color="D9D9D9"/>
+        </w:pBdr>
+      </w:pPr>
+      <w:r>
+        <w:rPr>
+          <w:rFonts w:ascii="Consolas" w:hAnsi="Consolas"/>
+          <w:sz w:val="17"/>
+        </w:rPr>
+        <w:t xml:space="preserve">    updated_at = models.DateTimeField(auto_now=True)</w:t>
+      </w:r>
+    </w:p>
+    <w:p>
+      <w:pPr>
+        <w:widowControl/>
+        <w:spacing w:line="240" w:lineRule="auto" w:after="0" w:before="0"/>
+        <w:ind w:firstLine="0" w:left="198" w:right="113"/>
+        <w:shd w:val="clear" w:fill="F5F5F5" w:color="auto"/>
+        <w:pBdr>
+          <w:left w:val="single" w:sz="4" w:space="1" w:color="D9D9D9"/>
+          <w:right w:val="single" w:sz="4" w:space="1" w:color="D9D9D9"/>
+        </w:pBdr>
+      </w:pPr>
+      <w:r>
+        <w:rPr>
+          <w:rFonts w:ascii="Consolas" w:hAnsi="Consolas"/>
+          <w:sz w:val="17"/>
+        </w:rPr>
+        <w:t xml:space="preserve"> </w:t>
+      </w:r>
+    </w:p>
+    <w:p>
+      <w:pPr>
+        <w:widowControl/>
+        <w:spacing w:line="240" w:lineRule="auto" w:after="0" w:before="0"/>
+        <w:ind w:firstLine="0" w:left="198" w:right="113"/>
+        <w:shd w:val="clear" w:fill="F5F5F5" w:color="auto"/>
+        <w:pBdr>
+          <w:left w:val="single" w:sz="4" w:space="1" w:color="D9D9D9"/>
+          <w:right w:val="single" w:sz="4" w:space="1" w:color="D9D9D9"/>
+        </w:pBdr>
+      </w:pPr>
+      <w:r>
+        <w:rPr>
+          <w:rFonts w:ascii="Consolas" w:hAnsi="Consolas"/>
+          <w:sz w:val="17"/>
+        </w:rPr>
+        <w:t xml:space="preserve">    class Meta:</w:t>
+      </w:r>
+    </w:p>
+    <w:p>
+      <w:pPr>
+        <w:widowControl/>
+        <w:spacing w:line="240" w:lineRule="auto" w:after="0" w:before="0"/>
+        <w:ind w:firstLine="0" w:left="198" w:right="113"/>
+        <w:shd w:val="clear" w:fill="F5F5F5" w:color="auto"/>
+        <w:pBdr>
+          <w:left w:val="single" w:sz="4" w:space="1" w:color="D9D9D9"/>
+          <w:right w:val="single" w:sz="4" w:space="1" w:color="D9D9D9"/>
+        </w:pBdr>
+      </w:pPr>
+      <w:r>
+        <w:rPr>
+          <w:rFonts w:ascii="Consolas" w:hAnsi="Consolas"/>
+          <w:sz w:val="17"/>
+        </w:rPr>
+        <w:t xml:space="preserve">        ordering = ["term"]</w:t>
+      </w:r>
+    </w:p>
+    <w:p>
+      <w:pPr>
+        <w:widowControl/>
+        <w:spacing w:line="240" w:lineRule="auto" w:after="0" w:before="0"/>
+        <w:ind w:firstLine="0" w:left="198" w:right="113"/>
+        <w:shd w:val="clear" w:fill="F5F5F5" w:color="auto"/>
+        <w:pBdr>
+          <w:left w:val="single" w:sz="4" w:space="1" w:color="D9D9D9"/>
+          <w:right w:val="single" w:sz="4" w:space="1" w:color="D9D9D9"/>
+        </w:pBdr>
+      </w:pPr>
+      <w:r>
+        <w:rPr>
+          <w:rFonts w:ascii="Consolas" w:hAnsi="Consolas"/>
+          <w:sz w:val="17"/>
+        </w:rPr>
+        <w:t xml:space="preserve">        indexes = [</w:t>
+      </w:r>
+    </w:p>
+    <w:p>
+      <w:pPr>
+        <w:widowControl/>
+        <w:spacing w:line="240" w:lineRule="auto" w:after="0" w:before="0"/>
+        <w:ind w:firstLine="0" w:left="198" w:right="113"/>
+        <w:shd w:val="clear" w:fill="F5F5F5" w:color="auto"/>
+        <w:pBdr>
+          <w:left w:val="single" w:sz="4" w:space="1" w:color="D9D9D9"/>
+          <w:right w:val="single" w:sz="4" w:space="1" w:color="D9D9D9"/>
+        </w:pBdr>
+      </w:pPr>
+      <w:r>
+        <w:rPr>
+          <w:rFonts w:ascii="Consolas" w:hAnsi="Consolas"/>
+          <w:sz w:val="17"/>
+        </w:rPr>
+        <w:t xml:space="preserve">            models.Index(fields=["term"]),</w:t>
+      </w:r>
+    </w:p>
+    <w:p>
+      <w:pPr>
+        <w:widowControl/>
+        <w:spacing w:line="240" w:lineRule="auto" w:after="0" w:before="0"/>
+        <w:ind w:firstLine="0" w:left="198" w:right="113"/>
+        <w:shd w:val="clear" w:fill="F5F5F5" w:color="auto"/>
+        <w:pBdr>
+          <w:left w:val="single" w:sz="4" w:space="1" w:color="D9D9D9"/>
+          <w:right w:val="single" w:sz="4" w:space="1" w:color="D9D9D9"/>
+        </w:pBdr>
+      </w:pPr>
+      <w:r>
+        <w:rPr>
+          <w:rFonts w:ascii="Consolas" w:hAnsi="Consolas"/>
+          <w:sz w:val="17"/>
+        </w:rPr>
+        <w:t xml:space="preserve">            models.Index(fields=["slug"]),</w:t>
+      </w:r>
+    </w:p>
+    <w:p>
+      <w:pPr>
+        <w:widowControl/>
+        <w:spacing w:line="240" w:lineRule="auto" w:after="0" w:before="0"/>
+        <w:ind w:firstLine="0" w:left="198" w:right="113"/>
+        <w:shd w:val="clear" w:fill="F5F5F5" w:color="auto"/>
+        <w:pBdr>
+          <w:left w:val="single" w:sz="4" w:space="1" w:color="D9D9D9"/>
+          <w:right w:val="single" w:sz="4" w:space="1" w:color="D9D9D9"/>
+        </w:pBdr>
+      </w:pPr>
+      <w:r>
+        <w:rPr>
+          <w:rFonts w:ascii="Consolas" w:hAnsi="Consolas"/>
+          <w:sz w:val="17"/>
+        </w:rPr>
+        <w:t xml:space="preserve">        ]</w:t>
+      </w:r>
+    </w:p>
+    <w:p>
+      <w:pPr>
+        <w:widowControl/>
+        <w:spacing w:line="240" w:lineRule="auto" w:after="0" w:before="0"/>
+        <w:ind w:firstLine="0" w:left="198" w:right="113"/>
+        <w:shd w:val="clear" w:fill="F5F5F5" w:color="auto"/>
+        <w:pBdr>
+          <w:left w:val="single" w:sz="4" w:space="1" w:color="D9D9D9"/>
+          <w:right w:val="single" w:sz="4" w:space="1" w:color="D9D9D9"/>
+        </w:pBdr>
+      </w:pPr>
+      <w:r>
+        <w:rPr>
+          <w:rFonts w:ascii="Consolas" w:hAnsi="Consolas"/>
+          <w:sz w:val="17"/>
+        </w:rPr>
+        <w:t xml:space="preserve"> </w:t>
+      </w:r>
+    </w:p>
+    <w:p>
+      <w:pPr>
+        <w:widowControl/>
+        <w:spacing w:line="240" w:lineRule="auto" w:after="0" w:before="0"/>
+        <w:ind w:firstLine="0" w:left="198" w:right="113"/>
+        <w:shd w:val="clear" w:fill="F5F5F5" w:color="auto"/>
+        <w:pBdr>
+          <w:left w:val="single" w:sz="4" w:space="1" w:color="D9D9D9"/>
+          <w:right w:val="single" w:sz="4" w:space="1" w:color="D9D9D9"/>
+        </w:pBdr>
+      </w:pPr>
+      <w:r>
+        <w:rPr>
+          <w:rFonts w:ascii="Consolas" w:hAnsi="Consolas"/>
+          <w:sz w:val="17"/>
+        </w:rPr>
+        <w:t xml:space="preserve">    def __str__(self):</w:t>
+      </w:r>
+    </w:p>
+    <w:p>
+      <w:pPr>
+        <w:widowControl/>
+        <w:spacing w:line="240" w:lineRule="auto" w:after="0" w:before="0"/>
+        <w:ind w:firstLine="0" w:left="198" w:right="113"/>
+        <w:shd w:val="clear" w:fill="F5F5F5" w:color="auto"/>
+        <w:pBdr>
+          <w:left w:val="single" w:sz="4" w:space="1" w:color="D9D9D9"/>
+          <w:right w:val="single" w:sz="4" w:space="1" w:color="D9D9D9"/>
+        </w:pBdr>
+      </w:pPr>
+      <w:r>
+        <w:rPr>
+          <w:rFonts w:ascii="Consolas" w:hAnsi="Consolas"/>
+          <w:sz w:val="17"/>
+        </w:rPr>
+        <w:t xml:space="preserve">        return self.term</w:t>
+      </w:r>
+    </w:p>
+    <w:p>
+      <w:pPr>
+        <w:widowControl/>
+        <w:spacing w:line="240" w:lineRule="auto" w:after="0" w:before="0"/>
+        <w:ind w:firstLine="0" w:left="198" w:right="113"/>
+        <w:shd w:val="clear" w:fill="F5F5F5" w:color="auto"/>
+        <w:pBdr>
+          <w:left w:val="single" w:sz="4" w:space="1" w:color="D9D9D9"/>
+          <w:right w:val="single" w:sz="4" w:space="1" w:color="D9D9D9"/>
+        </w:pBdr>
+      </w:pPr>
+      <w:r>
+        <w:rPr>
+          <w:rFonts w:ascii="Consolas" w:hAnsi="Consolas"/>
+          <w:sz w:val="17"/>
+        </w:rPr>
+        <w:t xml:space="preserve"> </w:t>
+      </w:r>
+    </w:p>
+    <w:p>
+      <w:pPr>
+        <w:widowControl/>
+        <w:spacing w:line="240" w:lineRule="auto" w:after="0" w:before="0"/>
+        <w:ind w:firstLine="0" w:left="198" w:right="113"/>
+        <w:shd w:val="clear" w:fill="F5F5F5" w:color="auto"/>
+        <w:pBdr>
+          <w:left w:val="single" w:sz="4" w:space="1" w:color="D9D9D9"/>
+          <w:right w:val="single" w:sz="4" w:space="1" w:color="D9D9D9"/>
+        </w:pBdr>
+      </w:pPr>
+      <w:r>
+        <w:rPr>
+          <w:rFonts w:ascii="Consolas" w:hAnsi="Consolas"/>
+          <w:sz w:val="17"/>
+        </w:rPr>
+        <w:t xml:space="preserve">    def get_absolute_url(self):</w:t>
+      </w:r>
+    </w:p>
+    <w:p>
+      <w:pPr>
+        <w:widowControl/>
+        <w:spacing w:line="240" w:lineRule="auto" w:after="0" w:before="0"/>
+        <w:ind w:firstLine="0" w:left="198" w:right="113"/>
+        <w:shd w:val="clear" w:fill="F5F5F5" w:color="auto"/>
+        <w:pBdr>
+          <w:left w:val="single" w:sz="4" w:space="1" w:color="D9D9D9"/>
+          <w:right w:val="single" w:sz="4" w:space="1" w:color="D9D9D9"/>
+        </w:pBdr>
+      </w:pPr>
+      <w:r>
+        <w:rPr>
+          <w:rFonts w:ascii="Consolas" w:hAnsi="Consolas"/>
+          <w:sz w:val="17"/>
+        </w:rPr>
+        <w:t xml:space="preserve">        return reverse("term_detail", kwargs={"slug": self.slug})</w:t>
+      </w:r>
+    </w:p>
+    <w:p>
+      <w:pPr>
+        <w:spacing w:before="60" w:after="120" w:line="276" w:lineRule="auto"/>
+        <w:ind w:firstLine="0" w:left="0"/>
+      </w:pPr>
+      <w:r>
+        <w:t>Лістинг демонструє центральну модель словникової статті: поля визначення, зв'язки з категорією та джерелом, а також службові атрибути для навігації й оновлення.</w:t>
+      </w:r>
+    </w:p>
+    <w:p>
+      <w:pPr>
+        <w:spacing w:before="200" w:after="20"/>
+        <w:ind w:firstLine="0"/>
+      </w:pPr>
+      <w:r>
+        <w:rPr>
+          <w:b/>
+        </w:rPr>
+        <w:t>Лістинг В.2 - Модель користувацької пропозиції UserSuggestion</w:t>
+      </w:r>
+    </w:p>
+    <w:p>
+      <w:pPr>
+        <w:spacing w:before="0" w:after="60"/>
+        <w:ind w:firstLine="0"/>
+      </w:pPr>
+      <w:r>
+        <w:rPr>
+          <w:i/>
+          <w:sz w:val="20"/>
+        </w:rPr>
+        <w:t>Файл: dictionary/models.py, рядки 72-96.</w:t>
+      </w:r>
+    </w:p>
+    <w:p>
+      <w:pPr>
+        <w:widowControl/>
+        <w:spacing w:line="240" w:lineRule="auto" w:after="0" w:before="0"/>
+        <w:ind w:firstLine="0" w:left="198" w:right="113"/>
+        <w:shd w:val="clear" w:fill="F5F5F5" w:color="auto"/>
+        <w:pBdr>
+          <w:left w:val="single" w:sz="4" w:space="1" w:color="D9D9D9"/>
+          <w:right w:val="single" w:sz="4" w:space="1" w:color="D9D9D9"/>
+        </w:pBdr>
+      </w:pPr>
+      <w:r>
+        <w:rPr>
+          <w:rFonts w:ascii="Consolas" w:hAnsi="Consolas"/>
+          <w:sz w:val="17"/>
+        </w:rPr>
+        <w:t>class UserSuggestion(models.Model):</w:t>
+      </w:r>
+    </w:p>
+    <w:p>
+      <w:pPr>
+        <w:widowControl/>
+        <w:spacing w:line="240" w:lineRule="auto" w:after="0" w:before="0"/>
+        <w:ind w:firstLine="0" w:left="198" w:right="113"/>
+        <w:shd w:val="clear" w:fill="F5F5F5" w:color="auto"/>
+        <w:pBdr>
+          <w:left w:val="single" w:sz="4" w:space="1" w:color="D9D9D9"/>
+          <w:right w:val="single" w:sz="4" w:space="1" w:color="D9D9D9"/>
+        </w:pBdr>
+      </w:pPr>
+      <w:r>
+        <w:rPr>
+          <w:rFonts w:ascii="Consolas" w:hAnsi="Consolas"/>
+          <w:sz w:val="17"/>
+        </w:rPr>
+        <w:t xml:space="preserve">    STATUS_NEW = "new"</w:t>
+      </w:r>
+    </w:p>
+    <w:p>
+      <w:pPr>
+        <w:widowControl/>
+        <w:spacing w:line="240" w:lineRule="auto" w:after="0" w:before="0"/>
+        <w:ind w:firstLine="0" w:left="198" w:right="113"/>
+        <w:shd w:val="clear" w:fill="F5F5F5" w:color="auto"/>
+        <w:pBdr>
+          <w:left w:val="single" w:sz="4" w:space="1" w:color="D9D9D9"/>
+          <w:right w:val="single" w:sz="4" w:space="1" w:color="D9D9D9"/>
+        </w:pBdr>
+      </w:pPr>
+      <w:r>
+        <w:rPr>
+          <w:rFonts w:ascii="Consolas" w:hAnsi="Consolas"/>
+          <w:sz w:val="17"/>
+        </w:rPr>
+        <w:t xml:space="preserve">    STATUS_REVIEWED = "reviewed"</w:t>
+      </w:r>
+    </w:p>
+    <w:p>
+      <w:pPr>
+        <w:widowControl/>
+        <w:spacing w:line="240" w:lineRule="auto" w:after="0" w:before="0"/>
+        <w:ind w:firstLine="0" w:left="198" w:right="113"/>
+        <w:shd w:val="clear" w:fill="F5F5F5" w:color="auto"/>
+        <w:pBdr>
+          <w:left w:val="single" w:sz="4" w:space="1" w:color="D9D9D9"/>
+          <w:right w:val="single" w:sz="4" w:space="1" w:color="D9D9D9"/>
+        </w:pBdr>
+      </w:pPr>
+      <w:r>
+        <w:rPr>
+          <w:rFonts w:ascii="Consolas" w:hAnsi="Consolas"/>
+          <w:sz w:val="17"/>
+        </w:rPr>
+        <w:t xml:space="preserve">    STATUS_REJECTED = "rejected"</w:t>
+      </w:r>
+    </w:p>
+    <w:p>
+      <w:pPr>
+        <w:widowControl/>
+        <w:spacing w:line="240" w:lineRule="auto" w:after="0" w:before="0"/>
+        <w:ind w:firstLine="0" w:left="198" w:right="113"/>
+        <w:shd w:val="clear" w:fill="F5F5F5" w:color="auto"/>
+        <w:pBdr>
+          <w:left w:val="single" w:sz="4" w:space="1" w:color="D9D9D9"/>
+          <w:right w:val="single" w:sz="4" w:space="1" w:color="D9D9D9"/>
+        </w:pBdr>
+      </w:pPr>
+      <w:r>
+        <w:rPr>
+          <w:rFonts w:ascii="Consolas" w:hAnsi="Consolas"/>
+          <w:sz w:val="17"/>
+        </w:rPr>
+        <w:t xml:space="preserve">    STATUS_CHOICES = [</w:t>
+      </w:r>
+    </w:p>
+    <w:p>
+      <w:pPr>
+        <w:widowControl/>
+        <w:spacing w:line="240" w:lineRule="auto" w:after="0" w:before="0"/>
+        <w:ind w:firstLine="0" w:left="198" w:right="113"/>
+        <w:shd w:val="clear" w:fill="F5F5F5" w:color="auto"/>
+        <w:pBdr>
+          <w:left w:val="single" w:sz="4" w:space="1" w:color="D9D9D9"/>
+          <w:right w:val="single" w:sz="4" w:space="1" w:color="D9D9D9"/>
+        </w:pBdr>
+      </w:pPr>
+      <w:r>
+        <w:rPr>
+          <w:rFonts w:ascii="Consolas" w:hAnsi="Consolas"/>
+          <w:sz w:val="17"/>
+        </w:rPr>
+        <w:t xml:space="preserve">        (STATUS_NEW, "New"),</w:t>
+      </w:r>
+    </w:p>
+    <w:p>
+      <w:pPr>
+        <w:widowControl/>
+        <w:spacing w:line="240" w:lineRule="auto" w:after="0" w:before="0"/>
+        <w:ind w:firstLine="0" w:left="198" w:right="113"/>
+        <w:shd w:val="clear" w:fill="F5F5F5" w:color="auto"/>
+        <w:pBdr>
+          <w:left w:val="single" w:sz="4" w:space="1" w:color="D9D9D9"/>
+          <w:right w:val="single" w:sz="4" w:space="1" w:color="D9D9D9"/>
+        </w:pBdr>
+      </w:pPr>
+      <w:r>
+        <w:rPr>
+          <w:rFonts w:ascii="Consolas" w:hAnsi="Consolas"/>
+          <w:sz w:val="17"/>
+        </w:rPr>
+        <w:t xml:space="preserve">        (STATUS_REVIEWED, "Reviewed"),</w:t>
+      </w:r>
+    </w:p>
+    <w:p>
+      <w:pPr>
+        <w:widowControl/>
+        <w:spacing w:line="240" w:lineRule="auto" w:after="0" w:before="0"/>
+        <w:ind w:firstLine="0" w:left="198" w:right="113"/>
+        <w:shd w:val="clear" w:fill="F5F5F5" w:color="auto"/>
+        <w:pBdr>
+          <w:left w:val="single" w:sz="4" w:space="1" w:color="D9D9D9"/>
+          <w:right w:val="single" w:sz="4" w:space="1" w:color="D9D9D9"/>
+        </w:pBdr>
+      </w:pPr>
+      <w:r>
+        <w:rPr>
+          <w:rFonts w:ascii="Consolas" w:hAnsi="Consolas"/>
+          <w:sz w:val="17"/>
+        </w:rPr>
+        <w:t xml:space="preserve">        (STATUS_REJECTED, "Rejected"),</w:t>
+      </w:r>
+    </w:p>
+    <w:p>
+      <w:pPr>
+        <w:widowControl/>
+        <w:spacing w:line="240" w:lineRule="auto" w:after="0" w:before="0"/>
+        <w:ind w:firstLine="0" w:left="198" w:right="113"/>
+        <w:shd w:val="clear" w:fill="F5F5F5" w:color="auto"/>
+        <w:pBdr>
+          <w:left w:val="single" w:sz="4" w:space="1" w:color="D9D9D9"/>
+          <w:right w:val="single" w:sz="4" w:space="1" w:color="D9D9D9"/>
+        </w:pBdr>
+      </w:pPr>
+      <w:r>
+        <w:rPr>
+          <w:rFonts w:ascii="Consolas" w:hAnsi="Consolas"/>
+          <w:sz w:val="17"/>
+        </w:rPr>
+        <w:t xml:space="preserve">    ]</w:t>
+      </w:r>
+    </w:p>
+    <w:p>
+      <w:pPr>
+        <w:widowControl/>
+        <w:spacing w:line="240" w:lineRule="auto" w:after="0" w:before="0"/>
+        <w:ind w:firstLine="0" w:left="198" w:right="113"/>
+        <w:shd w:val="clear" w:fill="F5F5F5" w:color="auto"/>
+        <w:pBdr>
+          <w:left w:val="single" w:sz="4" w:space="1" w:color="D9D9D9"/>
+          <w:right w:val="single" w:sz="4" w:space="1" w:color="D9D9D9"/>
+        </w:pBdr>
+      </w:pPr>
+      <w:r>
+        <w:rPr>
+          <w:rFonts w:ascii="Consolas" w:hAnsi="Consolas"/>
+          <w:sz w:val="17"/>
+        </w:rPr>
+        <w:t xml:space="preserve"> </w:t>
+      </w:r>
+    </w:p>
+    <w:p>
+      <w:pPr>
+        <w:widowControl/>
+        <w:spacing w:line="240" w:lineRule="auto" w:after="0" w:before="0"/>
+        <w:ind w:firstLine="0" w:left="198" w:right="113"/>
+        <w:shd w:val="clear" w:fill="F5F5F5" w:color="auto"/>
+        <w:pBdr>
+          <w:left w:val="single" w:sz="4" w:space="1" w:color="D9D9D9"/>
+          <w:right w:val="single" w:sz="4" w:space="1" w:color="D9D9D9"/>
+        </w:pBdr>
+      </w:pPr>
+      <w:r>
+        <w:rPr>
+          <w:rFonts w:ascii="Consolas" w:hAnsi="Consolas"/>
+          <w:sz w:val="17"/>
+        </w:rPr>
+        <w:t xml:space="preserve">    candidate_term = models.CharField(max_length=120)</w:t>
+      </w:r>
+    </w:p>
+    <w:p>
+      <w:pPr>
+        <w:widowControl/>
+        <w:spacing w:line="240" w:lineRule="auto" w:after="0" w:before="0"/>
+        <w:ind w:firstLine="0" w:left="198" w:right="113"/>
+        <w:shd w:val="clear" w:fill="F5F5F5" w:color="auto"/>
+        <w:pBdr>
+          <w:left w:val="single" w:sz="4" w:space="1" w:color="D9D9D9"/>
+          <w:right w:val="single" w:sz="4" w:space="1" w:color="D9D9D9"/>
+        </w:pBdr>
+      </w:pPr>
+      <w:r>
+        <w:rPr>
+          <w:rFonts w:ascii="Consolas" w:hAnsi="Consolas"/>
+          <w:sz w:val="17"/>
+        </w:rPr>
+        <w:t xml:space="preserve">    candidate_definition = models.TextField()</w:t>
+      </w:r>
+    </w:p>
+    <w:p>
+      <w:pPr>
+        <w:widowControl/>
+        <w:spacing w:line="240" w:lineRule="auto" w:after="0" w:before="0"/>
+        <w:ind w:firstLine="0" w:left="198" w:right="113"/>
+        <w:shd w:val="clear" w:fill="F5F5F5" w:color="auto"/>
+        <w:pBdr>
+          <w:left w:val="single" w:sz="4" w:space="1" w:color="D9D9D9"/>
+          <w:right w:val="single" w:sz="4" w:space="1" w:color="D9D9D9"/>
+        </w:pBdr>
+      </w:pPr>
+      <w:r>
+        <w:rPr>
+          <w:rFonts w:ascii="Consolas" w:hAnsi="Consolas"/>
+          <w:sz w:val="17"/>
+        </w:rPr>
+        <w:t xml:space="preserve">    contact_email = models.EmailField(blank=True)</w:t>
+      </w:r>
+    </w:p>
+    <w:p>
+      <w:pPr>
+        <w:widowControl/>
+        <w:spacing w:line="240" w:lineRule="auto" w:after="0" w:before="0"/>
+        <w:ind w:firstLine="0" w:left="198" w:right="113"/>
+        <w:shd w:val="clear" w:fill="F5F5F5" w:color="auto"/>
+        <w:pBdr>
+          <w:left w:val="single" w:sz="4" w:space="1" w:color="D9D9D9"/>
+          <w:right w:val="single" w:sz="4" w:space="1" w:color="D9D9D9"/>
+        </w:pBdr>
+      </w:pPr>
+      <w:r>
+        <w:rPr>
+          <w:rFonts w:ascii="Consolas" w:hAnsi="Consolas"/>
+          <w:sz w:val="17"/>
+        </w:rPr>
+        <w:t xml:space="preserve">    status = models.CharField(</w:t>
+      </w:r>
+    </w:p>
+    <w:p>
+      <w:pPr>
+        <w:widowControl/>
+        <w:spacing w:line="240" w:lineRule="auto" w:after="0" w:before="0"/>
+        <w:ind w:firstLine="0" w:left="198" w:right="113"/>
+        <w:shd w:val="clear" w:fill="F5F5F5" w:color="auto"/>
+        <w:pBdr>
+          <w:left w:val="single" w:sz="4" w:space="1" w:color="D9D9D9"/>
+          <w:right w:val="single" w:sz="4" w:space="1" w:color="D9D9D9"/>
+        </w:pBdr>
+      </w:pPr>
+      <w:r>
+        <w:rPr>
+          <w:rFonts w:ascii="Consolas" w:hAnsi="Consolas"/>
+          <w:sz w:val="17"/>
+        </w:rPr>
+        <w:t xml:space="preserve">        max_length=12,</w:t>
+      </w:r>
+    </w:p>
+    <w:p>
+      <w:pPr>
+        <w:widowControl/>
+        <w:spacing w:line="240" w:lineRule="auto" w:after="0" w:before="0"/>
+        <w:ind w:firstLine="0" w:left="198" w:right="113"/>
+        <w:shd w:val="clear" w:fill="F5F5F5" w:color="auto"/>
+        <w:pBdr>
+          <w:left w:val="single" w:sz="4" w:space="1" w:color="D9D9D9"/>
+          <w:right w:val="single" w:sz="4" w:space="1" w:color="D9D9D9"/>
+        </w:pBdr>
+      </w:pPr>
+      <w:r>
+        <w:rPr>
+          <w:rFonts w:ascii="Consolas" w:hAnsi="Consolas"/>
+          <w:sz w:val="17"/>
+        </w:rPr>
+        <w:t xml:space="preserve">        choices=STATUS_CHOICES,</w:t>
+      </w:r>
+    </w:p>
+    <w:p>
+      <w:pPr>
+        <w:widowControl/>
+        <w:spacing w:line="240" w:lineRule="auto" w:after="0" w:before="0"/>
+        <w:ind w:firstLine="0" w:left="198" w:right="113"/>
+        <w:shd w:val="clear" w:fill="F5F5F5" w:color="auto"/>
+        <w:pBdr>
+          <w:left w:val="single" w:sz="4" w:space="1" w:color="D9D9D9"/>
+          <w:right w:val="single" w:sz="4" w:space="1" w:color="D9D9D9"/>
+        </w:pBdr>
+      </w:pPr>
+      <w:r>
+        <w:rPr>
+          <w:rFonts w:ascii="Consolas" w:hAnsi="Consolas"/>
+          <w:sz w:val="17"/>
+        </w:rPr>
+        <w:t xml:space="preserve">        default=STATUS_NEW,</w:t>
+      </w:r>
+    </w:p>
+    <w:p>
+      <w:pPr>
+        <w:widowControl/>
+        <w:spacing w:line="240" w:lineRule="auto" w:after="0" w:before="0"/>
+        <w:ind w:firstLine="0" w:left="198" w:right="113"/>
+        <w:shd w:val="clear" w:fill="F5F5F5" w:color="auto"/>
+        <w:pBdr>
+          <w:left w:val="single" w:sz="4" w:space="1" w:color="D9D9D9"/>
+          <w:right w:val="single" w:sz="4" w:space="1" w:color="D9D9D9"/>
+        </w:pBdr>
+      </w:pPr>
+      <w:r>
+        <w:rPr>
+          <w:rFonts w:ascii="Consolas" w:hAnsi="Consolas"/>
+          <w:sz w:val="17"/>
+        </w:rPr>
+        <w:t xml:space="preserve">    )</w:t>
+      </w:r>
+    </w:p>
+    <w:p>
+      <w:pPr>
+        <w:widowControl/>
+        <w:spacing w:line="240" w:lineRule="auto" w:after="0" w:before="0"/>
+        <w:ind w:firstLine="0" w:left="198" w:right="113"/>
+        <w:shd w:val="clear" w:fill="F5F5F5" w:color="auto"/>
+        <w:pBdr>
+          <w:left w:val="single" w:sz="4" w:space="1" w:color="D9D9D9"/>
+          <w:right w:val="single" w:sz="4" w:space="1" w:color="D9D9D9"/>
+        </w:pBdr>
+      </w:pPr>
+      <w:r>
+        <w:rPr>
+          <w:rFonts w:ascii="Consolas" w:hAnsi="Consolas"/>
+          <w:sz w:val="17"/>
+        </w:rPr>
+        <w:t xml:space="preserve">    created_at = models.DateTimeField(auto_now_add=True)</w:t>
+      </w:r>
+    </w:p>
+    <w:p>
+      <w:pPr>
+        <w:widowControl/>
+        <w:spacing w:line="240" w:lineRule="auto" w:after="0" w:before="0"/>
+        <w:ind w:firstLine="0" w:left="198" w:right="113"/>
+        <w:shd w:val="clear" w:fill="F5F5F5" w:color="auto"/>
+        <w:pBdr>
+          <w:left w:val="single" w:sz="4" w:space="1" w:color="D9D9D9"/>
+          <w:right w:val="single" w:sz="4" w:space="1" w:color="D9D9D9"/>
+        </w:pBdr>
+      </w:pPr>
+      <w:r>
+        <w:rPr>
+          <w:rFonts w:ascii="Consolas" w:hAnsi="Consolas"/>
+          <w:sz w:val="17"/>
+        </w:rPr>
+        <w:t xml:space="preserve"> </w:t>
+      </w:r>
+    </w:p>
+    <w:p>
+      <w:pPr>
+        <w:widowControl/>
+        <w:spacing w:line="240" w:lineRule="auto" w:after="0" w:before="0"/>
+        <w:ind w:firstLine="0" w:left="198" w:right="113"/>
+        <w:shd w:val="clear" w:fill="F5F5F5" w:color="auto"/>
+        <w:pBdr>
+          <w:left w:val="single" w:sz="4" w:space="1" w:color="D9D9D9"/>
+          <w:right w:val="single" w:sz="4" w:space="1" w:color="D9D9D9"/>
+        </w:pBdr>
+      </w:pPr>
+      <w:r>
+        <w:rPr>
+          <w:rFonts w:ascii="Consolas" w:hAnsi="Consolas"/>
+          <w:sz w:val="17"/>
+        </w:rPr>
+        <w:t xml:space="preserve">    class Meta:</w:t>
+      </w:r>
+    </w:p>
+    <w:p>
+      <w:pPr>
+        <w:widowControl/>
+        <w:spacing w:line="240" w:lineRule="auto" w:after="0" w:before="0"/>
+        <w:ind w:firstLine="0" w:left="198" w:right="113"/>
+        <w:shd w:val="clear" w:fill="F5F5F5" w:color="auto"/>
+        <w:pBdr>
+          <w:left w:val="single" w:sz="4" w:space="1" w:color="D9D9D9"/>
+          <w:right w:val="single" w:sz="4" w:space="1" w:color="D9D9D9"/>
+        </w:pBdr>
+      </w:pPr>
+      <w:r>
+        <w:rPr>
+          <w:rFonts w:ascii="Consolas" w:hAnsi="Consolas"/>
+          <w:sz w:val="17"/>
+        </w:rPr>
+        <w:t xml:space="preserve">        ordering = ["-created_at"]</w:t>
+      </w:r>
+    </w:p>
+    <w:p>
+      <w:pPr>
+        <w:widowControl/>
+        <w:spacing w:line="240" w:lineRule="auto" w:after="0" w:before="0"/>
+        <w:ind w:firstLine="0" w:left="198" w:right="113"/>
+        <w:shd w:val="clear" w:fill="F5F5F5" w:color="auto"/>
+        <w:pBdr>
+          <w:left w:val="single" w:sz="4" w:space="1" w:color="D9D9D9"/>
+          <w:right w:val="single" w:sz="4" w:space="1" w:color="D9D9D9"/>
+        </w:pBdr>
+      </w:pPr>
+      <w:r>
+        <w:rPr>
+          <w:rFonts w:ascii="Consolas" w:hAnsi="Consolas"/>
+          <w:sz w:val="17"/>
+        </w:rPr>
+        <w:t xml:space="preserve"> </w:t>
+      </w:r>
+    </w:p>
+    <w:p>
+      <w:pPr>
+        <w:widowControl/>
+        <w:spacing w:line="240" w:lineRule="auto" w:after="0" w:before="0"/>
+        <w:ind w:firstLine="0" w:left="198" w:right="113"/>
+        <w:shd w:val="clear" w:fill="F5F5F5" w:color="auto"/>
+        <w:pBdr>
+          <w:left w:val="single" w:sz="4" w:space="1" w:color="D9D9D9"/>
+          <w:right w:val="single" w:sz="4" w:space="1" w:color="D9D9D9"/>
+        </w:pBdr>
+      </w:pPr>
+      <w:r>
+        <w:rPr>
+          <w:rFonts w:ascii="Consolas" w:hAnsi="Consolas"/>
+          <w:sz w:val="17"/>
+        </w:rPr>
+        <w:t xml:space="preserve">    def __str__(self):</w:t>
+      </w:r>
+    </w:p>
+    <w:p>
+      <w:pPr>
+        <w:widowControl/>
+        <w:spacing w:line="240" w:lineRule="auto" w:after="0" w:before="0"/>
+        <w:ind w:firstLine="0" w:left="198" w:right="113"/>
+        <w:shd w:val="clear" w:fill="F5F5F5" w:color="auto"/>
+        <w:pBdr>
+          <w:left w:val="single" w:sz="4" w:space="1" w:color="D9D9D9"/>
+          <w:right w:val="single" w:sz="4" w:space="1" w:color="D9D9D9"/>
+        </w:pBdr>
+      </w:pPr>
+      <w:r>
+        <w:rPr>
+          <w:rFonts w:ascii="Consolas" w:hAnsi="Consolas"/>
+          <w:sz w:val="17"/>
+        </w:rPr>
+        <w:t xml:space="preserve">        return f"{self.candidate_term} ({self.status})"</w:t>
+      </w:r>
+    </w:p>
+    <w:p>
+      <w:pPr>
+        <w:spacing w:before="60" w:after="120" w:line="276" w:lineRule="auto"/>
+        <w:ind w:firstLine="0" w:left="0"/>
+      </w:pPr>
+      <w:r>
+        <w:t>Лістинг показує модель пропозиції нового терміна зі статусом модерації, контактним полем і фіксацією часу створення запису.</w:t>
+      </w:r>
+    </w:p>
+    <w:p>
+      <w:pPr>
+        <w:spacing w:before="240" w:after="80"/>
+        <w:ind w:firstLine="0"/>
+      </w:pPr>
+      <w:r>
+        <w:rPr>
+          <w:b/>
+        </w:rPr>
+        <w:t>Пошук і форми</w:t>
+      </w:r>
+    </w:p>
+    <w:p>
+      <w:pPr>
+        <w:spacing w:before="200" w:after="20"/>
+        <w:ind w:firstLine="0"/>
+      </w:pPr>
+      <w:r>
+        <w:rPr>
+          <w:b/>
+        </w:rPr>
+        <w:t>Лістинг В.3 - Реалізація term_list з Q-пошуком</w:t>
+      </w:r>
+    </w:p>
+    <w:p>
+      <w:pPr>
+        <w:spacing w:before="0" w:after="60"/>
+        <w:ind w:firstLine="0"/>
+      </w:pPr>
+      <w:r>
+        <w:rPr>
+          <w:i/>
+          <w:sz w:val="20"/>
+        </w:rPr>
+        <w:t>Файл: dictionary/views.py, рядки 25-48.</w:t>
+      </w:r>
+    </w:p>
+    <w:p>
+      <w:pPr>
+        <w:widowControl/>
+        <w:spacing w:line="240" w:lineRule="auto" w:after="0" w:before="0"/>
+        <w:ind w:firstLine="0" w:left="198" w:right="113"/>
+        <w:shd w:val="clear" w:fill="F5F5F5" w:color="auto"/>
+        <w:pBdr>
+          <w:left w:val="single" w:sz="4" w:space="1" w:color="D9D9D9"/>
+          <w:right w:val="single" w:sz="4" w:space="1" w:color="D9D9D9"/>
+        </w:pBdr>
+      </w:pPr>
+      <w:r>
+        <w:rPr>
+          <w:rFonts w:ascii="Consolas" w:hAnsi="Consolas"/>
+          <w:sz w:val="17"/>
+        </w:rPr>
+        <w:t>def term_list(request):</w:t>
+      </w:r>
+    </w:p>
+    <w:p>
+      <w:pPr>
+        <w:widowControl/>
+        <w:spacing w:line="240" w:lineRule="auto" w:after="0" w:before="0"/>
+        <w:ind w:firstLine="0" w:left="198" w:right="113"/>
+        <w:shd w:val="clear" w:fill="F5F5F5" w:color="auto"/>
+        <w:pBdr>
+          <w:left w:val="single" w:sz="4" w:space="1" w:color="D9D9D9"/>
+          <w:right w:val="single" w:sz="4" w:space="1" w:color="D9D9D9"/>
+        </w:pBdr>
+      </w:pPr>
+      <w:r>
+        <w:rPr>
+          <w:rFonts w:ascii="Consolas" w:hAnsi="Consolas"/>
+          <w:sz w:val="17"/>
+        </w:rPr>
+        <w:t xml:space="preserve">    query = request.GET.get("q", "").strip()</w:t>
+      </w:r>
+    </w:p>
+    <w:p>
+      <w:pPr>
+        <w:widowControl/>
+        <w:spacing w:line="240" w:lineRule="auto" w:after="0" w:before="0"/>
+        <w:ind w:firstLine="0" w:left="198" w:right="113"/>
+        <w:shd w:val="clear" w:fill="F5F5F5" w:color="auto"/>
+        <w:pBdr>
+          <w:left w:val="single" w:sz="4" w:space="1" w:color="D9D9D9"/>
+          <w:right w:val="single" w:sz="4" w:space="1" w:color="D9D9D9"/>
+        </w:pBdr>
+      </w:pPr>
+      <w:r>
+        <w:rPr>
+          <w:rFonts w:ascii="Consolas" w:hAnsi="Consolas"/>
+          <w:sz w:val="17"/>
+        </w:rPr>
+        <w:t xml:space="preserve">    category_slug = request.GET.get("category", "").strip()</w:t>
+      </w:r>
+    </w:p>
+    <w:p>
+      <w:pPr>
+        <w:widowControl/>
+        <w:spacing w:line="240" w:lineRule="auto" w:after="0" w:before="0"/>
+        <w:ind w:firstLine="0" w:left="198" w:right="113"/>
+        <w:shd w:val="clear" w:fill="F5F5F5" w:color="auto"/>
+        <w:pBdr>
+          <w:left w:val="single" w:sz="4" w:space="1" w:color="D9D9D9"/>
+          <w:right w:val="single" w:sz="4" w:space="1" w:color="D9D9D9"/>
+        </w:pBdr>
+      </w:pPr>
+      <w:r>
+        <w:rPr>
+          <w:rFonts w:ascii="Consolas" w:hAnsi="Consolas"/>
+          <w:sz w:val="17"/>
+        </w:rPr>
+        <w:t xml:space="preserve">    terms = Term.objects.select_related("category", "source")</w:t>
+      </w:r>
+    </w:p>
+    <w:p>
+      <w:pPr>
+        <w:widowControl/>
+        <w:spacing w:line="240" w:lineRule="auto" w:after="0" w:before="0"/>
+        <w:ind w:firstLine="0" w:left="198" w:right="113"/>
+        <w:shd w:val="clear" w:fill="F5F5F5" w:color="auto"/>
+        <w:pBdr>
+          <w:left w:val="single" w:sz="4" w:space="1" w:color="D9D9D9"/>
+          <w:right w:val="single" w:sz="4" w:space="1" w:color="D9D9D9"/>
+        </w:pBdr>
+      </w:pPr>
+      <w:r>
+        <w:rPr>
+          <w:rFonts w:ascii="Consolas" w:hAnsi="Consolas"/>
+          <w:sz w:val="17"/>
+        </w:rPr>
+        <w:t xml:space="preserve">    if query:</w:t>
+      </w:r>
+    </w:p>
+    <w:p>
+      <w:pPr>
+        <w:widowControl/>
+        <w:spacing w:line="240" w:lineRule="auto" w:after="0" w:before="0"/>
+        <w:ind w:firstLine="0" w:left="198" w:right="113"/>
+        <w:shd w:val="clear" w:fill="F5F5F5" w:color="auto"/>
+        <w:pBdr>
+          <w:left w:val="single" w:sz="4" w:space="1" w:color="D9D9D9"/>
+          <w:right w:val="single" w:sz="4" w:space="1" w:color="D9D9D9"/>
+        </w:pBdr>
+      </w:pPr>
+      <w:r>
+        <w:rPr>
+          <w:rFonts w:ascii="Consolas" w:hAnsi="Consolas"/>
+          <w:sz w:val="17"/>
+        </w:rPr>
+        <w:t xml:space="preserve">        terms = terms.filter(</w:t>
+      </w:r>
+    </w:p>
+    <w:p>
+      <w:pPr>
+        <w:widowControl/>
+        <w:spacing w:line="240" w:lineRule="auto" w:after="0" w:before="0"/>
+        <w:ind w:firstLine="0" w:left="198" w:right="113"/>
+        <w:shd w:val="clear" w:fill="F5F5F5" w:color="auto"/>
+        <w:pBdr>
+          <w:left w:val="single" w:sz="4" w:space="1" w:color="D9D9D9"/>
+          <w:right w:val="single" w:sz="4" w:space="1" w:color="D9D9D9"/>
+        </w:pBdr>
+      </w:pPr>
+      <w:r>
+        <w:rPr>
+          <w:rFonts w:ascii="Consolas" w:hAnsi="Consolas"/>
+          <w:sz w:val="17"/>
+        </w:rPr>
+        <w:t xml:space="preserve">            Q(term__icontains=query)</w:t>
+      </w:r>
+    </w:p>
+    <w:p>
+      <w:pPr>
+        <w:widowControl/>
+        <w:spacing w:line="240" w:lineRule="auto" w:after="0" w:before="0"/>
+        <w:ind w:firstLine="0" w:left="198" w:right="113"/>
+        <w:shd w:val="clear" w:fill="F5F5F5" w:color="auto"/>
+        <w:pBdr>
+          <w:left w:val="single" w:sz="4" w:space="1" w:color="D9D9D9"/>
+          <w:right w:val="single" w:sz="4" w:space="1" w:color="D9D9D9"/>
+        </w:pBdr>
+      </w:pPr>
+      <w:r>
+        <w:rPr>
+          <w:rFonts w:ascii="Consolas" w:hAnsi="Consolas"/>
+          <w:sz w:val="17"/>
+        </w:rPr>
+        <w:t xml:space="preserve">            | Q(short_definition__icontains=query)</w:t>
+      </w:r>
+    </w:p>
+    <w:p>
+      <w:pPr>
+        <w:widowControl/>
+        <w:spacing w:line="240" w:lineRule="auto" w:after="0" w:before="0"/>
+        <w:ind w:firstLine="0" w:left="198" w:right="113"/>
+        <w:shd w:val="clear" w:fill="F5F5F5" w:color="auto"/>
+        <w:pBdr>
+          <w:left w:val="single" w:sz="4" w:space="1" w:color="D9D9D9"/>
+          <w:right w:val="single" w:sz="4" w:space="1" w:color="D9D9D9"/>
+        </w:pBdr>
+      </w:pPr>
+      <w:r>
+        <w:rPr>
+          <w:rFonts w:ascii="Consolas" w:hAnsi="Consolas"/>
+          <w:sz w:val="17"/>
+        </w:rPr>
+        <w:t xml:space="preserve">            | Q(full_definition__icontains=query)</w:t>
+      </w:r>
+    </w:p>
+    <w:p>
+      <w:pPr>
+        <w:widowControl/>
+        <w:spacing w:line="240" w:lineRule="auto" w:after="0" w:before="0"/>
+        <w:ind w:firstLine="0" w:left="198" w:right="113"/>
+        <w:shd w:val="clear" w:fill="F5F5F5" w:color="auto"/>
+        <w:pBdr>
+          <w:left w:val="single" w:sz="4" w:space="1" w:color="D9D9D9"/>
+          <w:right w:val="single" w:sz="4" w:space="1" w:color="D9D9D9"/>
+        </w:pBdr>
+      </w:pPr>
+      <w:r>
+        <w:rPr>
+          <w:rFonts w:ascii="Consolas" w:hAnsi="Consolas"/>
+          <w:sz w:val="17"/>
+        </w:rPr>
+        <w:t xml:space="preserve">            | Q(synonyms__icontains=query)</w:t>
+      </w:r>
+    </w:p>
+    <w:p>
+      <w:pPr>
+        <w:widowControl/>
+        <w:spacing w:line="240" w:lineRule="auto" w:after="0" w:before="0"/>
+        <w:ind w:firstLine="0" w:left="198" w:right="113"/>
+        <w:shd w:val="clear" w:fill="F5F5F5" w:color="auto"/>
+        <w:pBdr>
+          <w:left w:val="single" w:sz="4" w:space="1" w:color="D9D9D9"/>
+          <w:right w:val="single" w:sz="4" w:space="1" w:color="D9D9D9"/>
+        </w:pBdr>
+      </w:pPr>
+      <w:r>
+        <w:rPr>
+          <w:rFonts w:ascii="Consolas" w:hAnsi="Consolas"/>
+          <w:sz w:val="17"/>
+        </w:rPr>
+        <w:t xml:space="preserve">        )</w:t>
+      </w:r>
+    </w:p>
+    <w:p>
+      <w:pPr>
+        <w:widowControl/>
+        <w:spacing w:line="240" w:lineRule="auto" w:after="0" w:before="0"/>
+        <w:ind w:firstLine="0" w:left="198" w:right="113"/>
+        <w:shd w:val="clear" w:fill="F5F5F5" w:color="auto"/>
+        <w:pBdr>
+          <w:left w:val="single" w:sz="4" w:space="1" w:color="D9D9D9"/>
+          <w:right w:val="single" w:sz="4" w:space="1" w:color="D9D9D9"/>
+        </w:pBdr>
+      </w:pPr>
+      <w:r>
+        <w:rPr>
+          <w:rFonts w:ascii="Consolas" w:hAnsi="Consolas"/>
+          <w:sz w:val="17"/>
+        </w:rPr>
+        <w:t xml:space="preserve">    if category_slug:</w:t>
+      </w:r>
+    </w:p>
+    <w:p>
+      <w:pPr>
+        <w:widowControl/>
+        <w:spacing w:line="240" w:lineRule="auto" w:after="0" w:before="0"/>
+        <w:ind w:firstLine="0" w:left="198" w:right="113"/>
+        <w:shd w:val="clear" w:fill="F5F5F5" w:color="auto"/>
+        <w:pBdr>
+          <w:left w:val="single" w:sz="4" w:space="1" w:color="D9D9D9"/>
+          <w:right w:val="single" w:sz="4" w:space="1" w:color="D9D9D9"/>
+        </w:pBdr>
+      </w:pPr>
+      <w:r>
+        <w:rPr>
+          <w:rFonts w:ascii="Consolas" w:hAnsi="Consolas"/>
+          <w:sz w:val="17"/>
+        </w:rPr>
+        <w:t xml:space="preserve">        terms = terms.filter(category__slug=category_slug)</w:t>
+      </w:r>
+    </w:p>
+    <w:p>
+      <w:pPr>
+        <w:widowControl/>
+        <w:spacing w:line="240" w:lineRule="auto" w:after="0" w:before="0"/>
+        <w:ind w:firstLine="0" w:left="198" w:right="113"/>
+        <w:shd w:val="clear" w:fill="F5F5F5" w:color="auto"/>
+        <w:pBdr>
+          <w:left w:val="single" w:sz="4" w:space="1" w:color="D9D9D9"/>
+          <w:right w:val="single" w:sz="4" w:space="1" w:color="D9D9D9"/>
+        </w:pBdr>
+      </w:pPr>
+      <w:r>
+        <w:rPr>
+          <w:rFonts w:ascii="Consolas" w:hAnsi="Consolas"/>
+          <w:sz w:val="17"/>
+        </w:rPr>
+        <w:t xml:space="preserve">    categories = Category.objects.all()</w:t>
+      </w:r>
+    </w:p>
+    <w:p>
+      <w:pPr>
+        <w:widowControl/>
+        <w:spacing w:line="240" w:lineRule="auto" w:after="0" w:before="0"/>
+        <w:ind w:firstLine="0" w:left="198" w:right="113"/>
+        <w:shd w:val="clear" w:fill="F5F5F5" w:color="auto"/>
+        <w:pBdr>
+          <w:left w:val="single" w:sz="4" w:space="1" w:color="D9D9D9"/>
+          <w:right w:val="single" w:sz="4" w:space="1" w:color="D9D9D9"/>
+        </w:pBdr>
+      </w:pPr>
+      <w:r>
+        <w:rPr>
+          <w:rFonts w:ascii="Consolas" w:hAnsi="Consolas"/>
+          <w:sz w:val="17"/>
+        </w:rPr>
+        <w:t xml:space="preserve">    return render(</w:t>
+      </w:r>
+    </w:p>
+    <w:p>
+      <w:pPr>
+        <w:widowControl/>
+        <w:spacing w:line="240" w:lineRule="auto" w:after="0" w:before="0"/>
+        <w:ind w:firstLine="0" w:left="198" w:right="113"/>
+        <w:shd w:val="clear" w:fill="F5F5F5" w:color="auto"/>
+        <w:pBdr>
+          <w:left w:val="single" w:sz="4" w:space="1" w:color="D9D9D9"/>
+          <w:right w:val="single" w:sz="4" w:space="1" w:color="D9D9D9"/>
+        </w:pBdr>
+      </w:pPr>
+      <w:r>
+        <w:rPr>
+          <w:rFonts w:ascii="Consolas" w:hAnsi="Consolas"/>
+          <w:sz w:val="17"/>
+        </w:rPr>
+        <w:t xml:space="preserve">        request,</w:t>
+      </w:r>
+    </w:p>
+    <w:p>
+      <w:pPr>
+        <w:widowControl/>
+        <w:spacing w:line="240" w:lineRule="auto" w:after="0" w:before="0"/>
+        <w:ind w:firstLine="0" w:left="198" w:right="113"/>
+        <w:shd w:val="clear" w:fill="F5F5F5" w:color="auto"/>
+        <w:pBdr>
+          <w:left w:val="single" w:sz="4" w:space="1" w:color="D9D9D9"/>
+          <w:right w:val="single" w:sz="4" w:space="1" w:color="D9D9D9"/>
+        </w:pBdr>
+      </w:pPr>
+      <w:r>
+        <w:rPr>
+          <w:rFonts w:ascii="Consolas" w:hAnsi="Consolas"/>
+          <w:sz w:val="17"/>
+        </w:rPr>
+        <w:t xml:space="preserve">        "dictionary/term_list.html",</w:t>
+      </w:r>
+    </w:p>
+    <w:p>
+      <w:pPr>
+        <w:widowControl/>
+        <w:spacing w:line="240" w:lineRule="auto" w:after="0" w:before="0"/>
+        <w:ind w:firstLine="0" w:left="198" w:right="113"/>
+        <w:shd w:val="clear" w:fill="F5F5F5" w:color="auto"/>
+        <w:pBdr>
+          <w:left w:val="single" w:sz="4" w:space="1" w:color="D9D9D9"/>
+          <w:right w:val="single" w:sz="4" w:space="1" w:color="D9D9D9"/>
+        </w:pBdr>
+      </w:pPr>
+      <w:r>
+        <w:rPr>
+          <w:rFonts w:ascii="Consolas" w:hAnsi="Consolas"/>
+          <w:sz w:val="17"/>
+        </w:rPr>
+        <w:t xml:space="preserve">        {</w:t>
+      </w:r>
+    </w:p>
+    <w:p>
+      <w:pPr>
+        <w:widowControl/>
+        <w:spacing w:line="240" w:lineRule="auto" w:after="0" w:before="0"/>
+        <w:ind w:firstLine="0" w:left="198" w:right="113"/>
+        <w:shd w:val="clear" w:fill="F5F5F5" w:color="auto"/>
+        <w:pBdr>
+          <w:left w:val="single" w:sz="4" w:space="1" w:color="D9D9D9"/>
+          <w:right w:val="single" w:sz="4" w:space="1" w:color="D9D9D9"/>
+        </w:pBdr>
+      </w:pPr>
+      <w:r>
+        <w:rPr>
+          <w:rFonts w:ascii="Consolas" w:hAnsi="Consolas"/>
+          <w:sz w:val="17"/>
+        </w:rPr>
+        <w:t xml:space="preserve">            "terms": terms,</w:t>
+      </w:r>
+    </w:p>
+    <w:p>
+      <w:pPr>
+        <w:widowControl/>
+        <w:spacing w:line="240" w:lineRule="auto" w:after="0" w:before="0"/>
+        <w:ind w:firstLine="0" w:left="198" w:right="113"/>
+        <w:shd w:val="clear" w:fill="F5F5F5" w:color="auto"/>
+        <w:pBdr>
+          <w:left w:val="single" w:sz="4" w:space="1" w:color="D9D9D9"/>
+          <w:right w:val="single" w:sz="4" w:space="1" w:color="D9D9D9"/>
+        </w:pBdr>
+      </w:pPr>
+      <w:r>
+        <w:rPr>
+          <w:rFonts w:ascii="Consolas" w:hAnsi="Consolas"/>
+          <w:sz w:val="17"/>
+        </w:rPr>
+        <w:t xml:space="preserve">            "categories": categories,</w:t>
+      </w:r>
+    </w:p>
+    <w:p>
+      <w:pPr>
+        <w:widowControl/>
+        <w:spacing w:line="240" w:lineRule="auto" w:after="0" w:before="0"/>
+        <w:ind w:firstLine="0" w:left="198" w:right="113"/>
+        <w:shd w:val="clear" w:fill="F5F5F5" w:color="auto"/>
+        <w:pBdr>
+          <w:left w:val="single" w:sz="4" w:space="1" w:color="D9D9D9"/>
+          <w:right w:val="single" w:sz="4" w:space="1" w:color="D9D9D9"/>
+        </w:pBdr>
+      </w:pPr>
+      <w:r>
+        <w:rPr>
+          <w:rFonts w:ascii="Consolas" w:hAnsi="Consolas"/>
+          <w:sz w:val="17"/>
+        </w:rPr>
+        <w:t xml:space="preserve">            "query": query,</w:t>
+      </w:r>
+    </w:p>
+    <w:p>
+      <w:pPr>
+        <w:widowControl/>
+        <w:spacing w:line="240" w:lineRule="auto" w:after="0" w:before="0"/>
+        <w:ind w:firstLine="0" w:left="198" w:right="113"/>
+        <w:shd w:val="clear" w:fill="F5F5F5" w:color="auto"/>
+        <w:pBdr>
+          <w:left w:val="single" w:sz="4" w:space="1" w:color="D9D9D9"/>
+          <w:right w:val="single" w:sz="4" w:space="1" w:color="D9D9D9"/>
+        </w:pBdr>
+      </w:pPr>
+      <w:r>
+        <w:rPr>
+          <w:rFonts w:ascii="Consolas" w:hAnsi="Consolas"/>
+          <w:sz w:val="17"/>
+        </w:rPr>
+        <w:t xml:space="preserve">            "selected_category": category_slug,</w:t>
+      </w:r>
+    </w:p>
+    <w:p>
+      <w:pPr>
+        <w:widowControl/>
+        <w:spacing w:line="240" w:lineRule="auto" w:after="0" w:before="0"/>
+        <w:ind w:firstLine="0" w:left="198" w:right="113"/>
+        <w:shd w:val="clear" w:fill="F5F5F5" w:color="auto"/>
+        <w:pBdr>
+          <w:left w:val="single" w:sz="4" w:space="1" w:color="D9D9D9"/>
+          <w:right w:val="single" w:sz="4" w:space="1" w:color="D9D9D9"/>
+        </w:pBdr>
+      </w:pPr>
+      <w:r>
+        <w:rPr>
+          <w:rFonts w:ascii="Consolas" w:hAnsi="Consolas"/>
+          <w:sz w:val="17"/>
+        </w:rPr>
+        <w:t xml:space="preserve">        },</w:t>
+      </w:r>
+    </w:p>
+    <w:p>
+      <w:pPr>
+        <w:widowControl/>
+        <w:spacing w:line="240" w:lineRule="auto" w:after="0" w:before="0"/>
+        <w:ind w:firstLine="0" w:left="198" w:right="113"/>
+        <w:shd w:val="clear" w:fill="F5F5F5" w:color="auto"/>
+        <w:pBdr>
+          <w:left w:val="single" w:sz="4" w:space="1" w:color="D9D9D9"/>
+          <w:right w:val="single" w:sz="4" w:space="1" w:color="D9D9D9"/>
+        </w:pBdr>
+      </w:pPr>
+      <w:r>
+        <w:rPr>
+          <w:rFonts w:ascii="Consolas" w:hAnsi="Consolas"/>
+          <w:sz w:val="17"/>
+        </w:rPr>
+        <w:t xml:space="preserve">    )</w:t>
+      </w:r>
+    </w:p>
+    <w:p>
+      <w:pPr>
+        <w:spacing w:before="60" w:after="120" w:line="276" w:lineRule="auto"/>
+        <w:ind w:firstLine="0" w:left="0"/>
+      </w:pPr>
+      <w:r>
+        <w:t>Лістинг демонструє комбінований сценарій каталогу: багатопольовий OR-пошук через Q та тематичну фільтрацію за slug категорії.</w:t>
+      </w:r>
+    </w:p>
+    <w:p>
+      <w:pPr>
+        <w:spacing w:before="200" w:after="20"/>
+        <w:ind w:firstLine="0"/>
+      </w:pPr>
+      <w:r>
+        <w:rPr>
+          <w:b/>
+        </w:rPr>
+        <w:t>Лістинг В.4 - Форма подання користувацької пропозиції</w:t>
+      </w:r>
+    </w:p>
+    <w:p>
+      <w:pPr>
+        <w:spacing w:before="0" w:after="60"/>
+        <w:ind w:firstLine="0"/>
+      </w:pPr>
+      <w:r>
+        <w:rPr>
+          <w:i/>
+          <w:sz w:val="20"/>
+        </w:rPr>
+        <w:t>Файл: dictionary/forms.py, рядки 1-12.</w:t>
+      </w:r>
+    </w:p>
+    <w:p>
+      <w:pPr>
+        <w:widowControl/>
+        <w:spacing w:line="240" w:lineRule="auto" w:after="0" w:before="0"/>
+        <w:ind w:firstLine="0" w:left="198" w:right="113"/>
+        <w:shd w:val="clear" w:fill="F5F5F5" w:color="auto"/>
+        <w:pBdr>
+          <w:left w:val="single" w:sz="4" w:space="1" w:color="D9D9D9"/>
+          <w:right w:val="single" w:sz="4" w:space="1" w:color="D9D9D9"/>
+        </w:pBdr>
+      </w:pPr>
+      <w:r>
+        <w:rPr>
+          <w:rFonts w:ascii="Consolas" w:hAnsi="Consolas"/>
+          <w:sz w:val="17"/>
+        </w:rPr>
+        <w:t>from django import forms</w:t>
+      </w:r>
+    </w:p>
+    <w:p>
+      <w:pPr>
+        <w:widowControl/>
+        <w:spacing w:line="240" w:lineRule="auto" w:after="0" w:before="0"/>
+        <w:ind w:firstLine="0" w:left="198" w:right="113"/>
+        <w:shd w:val="clear" w:fill="F5F5F5" w:color="auto"/>
+        <w:pBdr>
+          <w:left w:val="single" w:sz="4" w:space="1" w:color="D9D9D9"/>
+          <w:right w:val="single" w:sz="4" w:space="1" w:color="D9D9D9"/>
+        </w:pBdr>
+      </w:pPr>
+      <w:r>
+        <w:rPr>
+          <w:rFonts w:ascii="Consolas" w:hAnsi="Consolas"/>
+          <w:sz w:val="17"/>
+        </w:rPr>
+        <w:t xml:space="preserve"> </w:t>
+      </w:r>
+    </w:p>
+    <w:p>
+      <w:pPr>
+        <w:widowControl/>
+        <w:spacing w:line="240" w:lineRule="auto" w:after="0" w:before="0"/>
+        <w:ind w:firstLine="0" w:left="198" w:right="113"/>
+        <w:shd w:val="clear" w:fill="F5F5F5" w:color="auto"/>
+        <w:pBdr>
+          <w:left w:val="single" w:sz="4" w:space="1" w:color="D9D9D9"/>
+          <w:right w:val="single" w:sz="4" w:space="1" w:color="D9D9D9"/>
+        </w:pBdr>
+      </w:pPr>
+      <w:r>
+        <w:rPr>
+          <w:rFonts w:ascii="Consolas" w:hAnsi="Consolas"/>
+          <w:sz w:val="17"/>
+        </w:rPr>
+        <w:t>from .models import UserSuggestion</w:t>
+      </w:r>
+    </w:p>
+    <w:p>
+      <w:pPr>
+        <w:widowControl/>
+        <w:spacing w:line="240" w:lineRule="auto" w:after="0" w:before="0"/>
+        <w:ind w:firstLine="0" w:left="198" w:right="113"/>
+        <w:shd w:val="clear" w:fill="F5F5F5" w:color="auto"/>
+        <w:pBdr>
+          <w:left w:val="single" w:sz="4" w:space="1" w:color="D9D9D9"/>
+          <w:right w:val="single" w:sz="4" w:space="1" w:color="D9D9D9"/>
+        </w:pBdr>
+      </w:pPr>
+      <w:r>
+        <w:rPr>
+          <w:rFonts w:ascii="Consolas" w:hAnsi="Consolas"/>
+          <w:sz w:val="17"/>
+        </w:rPr>
+        <w:t xml:space="preserve"> </w:t>
+      </w:r>
+    </w:p>
+    <w:p>
+      <w:pPr>
+        <w:widowControl/>
+        <w:spacing w:line="240" w:lineRule="auto" w:after="0" w:before="0"/>
+        <w:ind w:firstLine="0" w:left="198" w:right="113"/>
+        <w:shd w:val="clear" w:fill="F5F5F5" w:color="auto"/>
+        <w:pBdr>
+          <w:left w:val="single" w:sz="4" w:space="1" w:color="D9D9D9"/>
+          <w:right w:val="single" w:sz="4" w:space="1" w:color="D9D9D9"/>
+        </w:pBdr>
+      </w:pPr>
+      <w:r>
+        <w:rPr>
+          <w:rFonts w:ascii="Consolas" w:hAnsi="Consolas"/>
+          <w:sz w:val="17"/>
+        </w:rPr>
+        <w:t>class UserSuggestionForm(forms.ModelForm):</w:t>
+      </w:r>
+    </w:p>
+    <w:p>
+      <w:pPr>
+        <w:widowControl/>
+        <w:spacing w:line="240" w:lineRule="auto" w:after="0" w:before="0"/>
+        <w:ind w:firstLine="0" w:left="198" w:right="113"/>
+        <w:shd w:val="clear" w:fill="F5F5F5" w:color="auto"/>
+        <w:pBdr>
+          <w:left w:val="single" w:sz="4" w:space="1" w:color="D9D9D9"/>
+          <w:right w:val="single" w:sz="4" w:space="1" w:color="D9D9D9"/>
+        </w:pBdr>
+      </w:pPr>
+      <w:r>
+        <w:rPr>
+          <w:rFonts w:ascii="Consolas" w:hAnsi="Consolas"/>
+          <w:sz w:val="17"/>
+        </w:rPr>
+        <w:t xml:space="preserve">    class Meta:</w:t>
+      </w:r>
+    </w:p>
+    <w:p>
+      <w:pPr>
+        <w:widowControl/>
+        <w:spacing w:line="240" w:lineRule="auto" w:after="0" w:before="0"/>
+        <w:ind w:firstLine="0" w:left="198" w:right="113"/>
+        <w:shd w:val="clear" w:fill="F5F5F5" w:color="auto"/>
+        <w:pBdr>
+          <w:left w:val="single" w:sz="4" w:space="1" w:color="D9D9D9"/>
+          <w:right w:val="single" w:sz="4" w:space="1" w:color="D9D9D9"/>
+        </w:pBdr>
+      </w:pPr>
+      <w:r>
+        <w:rPr>
+          <w:rFonts w:ascii="Consolas" w:hAnsi="Consolas"/>
+          <w:sz w:val="17"/>
+        </w:rPr>
+        <w:t xml:space="preserve">        model = UserSuggestion</w:t>
+      </w:r>
+    </w:p>
+    <w:p>
+      <w:pPr>
+        <w:widowControl/>
+        <w:spacing w:line="240" w:lineRule="auto" w:after="0" w:before="0"/>
+        <w:ind w:firstLine="0" w:left="198" w:right="113"/>
+        <w:shd w:val="clear" w:fill="F5F5F5" w:color="auto"/>
+        <w:pBdr>
+          <w:left w:val="single" w:sz="4" w:space="1" w:color="D9D9D9"/>
+          <w:right w:val="single" w:sz="4" w:space="1" w:color="D9D9D9"/>
+        </w:pBdr>
+      </w:pPr>
+      <w:r>
+        <w:rPr>
+          <w:rFonts w:ascii="Consolas" w:hAnsi="Consolas"/>
+          <w:sz w:val="17"/>
+        </w:rPr>
+        <w:t xml:space="preserve">        fields = ["candidate_term", "candidate_definition", "contact_email"]</w:t>
+      </w:r>
+    </w:p>
+    <w:p>
+      <w:pPr>
+        <w:widowControl/>
+        <w:spacing w:line="240" w:lineRule="auto" w:after="0" w:before="0"/>
+        <w:ind w:firstLine="0" w:left="198" w:right="113"/>
+        <w:shd w:val="clear" w:fill="F5F5F5" w:color="auto"/>
+        <w:pBdr>
+          <w:left w:val="single" w:sz="4" w:space="1" w:color="D9D9D9"/>
+          <w:right w:val="single" w:sz="4" w:space="1" w:color="D9D9D9"/>
+        </w:pBdr>
+      </w:pPr>
+      <w:r>
+        <w:rPr>
+          <w:rFonts w:ascii="Consolas" w:hAnsi="Consolas"/>
+          <w:sz w:val="17"/>
+        </w:rPr>
+        <w:t xml:space="preserve">        widgets = {</w:t>
+      </w:r>
+    </w:p>
+    <w:p>
+      <w:pPr>
+        <w:widowControl/>
+        <w:spacing w:line="240" w:lineRule="auto" w:after="0" w:before="0"/>
+        <w:ind w:firstLine="0" w:left="198" w:right="113"/>
+        <w:shd w:val="clear" w:fill="F5F5F5" w:color="auto"/>
+        <w:pBdr>
+          <w:left w:val="single" w:sz="4" w:space="1" w:color="D9D9D9"/>
+          <w:right w:val="single" w:sz="4" w:space="1" w:color="D9D9D9"/>
+        </w:pBdr>
+      </w:pPr>
+      <w:r>
+        <w:rPr>
+          <w:rFonts w:ascii="Consolas" w:hAnsi="Consolas"/>
+          <w:sz w:val="17"/>
+        </w:rPr>
+        <w:t xml:space="preserve">            "candidate_definition": forms.Textarea(attrs={"rows": 6}),</w:t>
+      </w:r>
+    </w:p>
+    <w:p>
+      <w:pPr>
+        <w:widowControl/>
+        <w:spacing w:line="240" w:lineRule="auto" w:after="0" w:before="0"/>
+        <w:ind w:firstLine="0" w:left="198" w:right="113"/>
+        <w:shd w:val="clear" w:fill="F5F5F5" w:color="auto"/>
+        <w:pBdr>
+          <w:left w:val="single" w:sz="4" w:space="1" w:color="D9D9D9"/>
+          <w:right w:val="single" w:sz="4" w:space="1" w:color="D9D9D9"/>
+        </w:pBdr>
+      </w:pPr>
+      <w:r>
+        <w:rPr>
+          <w:rFonts w:ascii="Consolas" w:hAnsi="Consolas"/>
+          <w:sz w:val="17"/>
+        </w:rPr>
+        <w:t xml:space="preserve">        }</w:t>
+      </w:r>
+    </w:p>
+    <w:p>
+      <w:pPr>
+        <w:spacing w:before="60" w:after="120" w:line="276" w:lineRule="auto"/>
+        <w:ind w:firstLine="0" w:left="0"/>
+      </w:pPr>
+      <w:r>
+        <w:t>Лістинг демонструє використання ModelForm для перевірки та збереження користувацької пропозиції.</w:t>
+      </w:r>
+    </w:p>
+    <w:p>
+      <w:pPr>
+        <w:spacing w:before="240" w:after="80"/>
+        <w:ind w:firstLine="0"/>
+      </w:pPr>
+      <w:r>
+        <w:rPr>
+          <w:b/>
+        </w:rPr>
+        <w:t>Адміністративна підсистема (Django Admin)</w:t>
+      </w:r>
+    </w:p>
+    <w:p>
+      <w:pPr>
+        <w:spacing w:before="200" w:after="20"/>
+        <w:ind w:firstLine="0"/>
+      </w:pPr>
+      <w:r>
+        <w:rPr>
+          <w:b/>
+        </w:rPr>
+        <w:t>Лістинг В.5 - Реєстрація Term і UserSuggestion у Django Admin</w:t>
+      </w:r>
+    </w:p>
+    <w:p>
+      <w:pPr>
+        <w:spacing w:before="0" w:after="60"/>
+        <w:ind w:firstLine="0"/>
+      </w:pPr>
+      <w:r>
+        <w:rPr>
+          <w:i/>
+          <w:sz w:val="20"/>
+        </w:rPr>
+        <w:t>Файл: dictionary/admin.py, рядки 19-32.</w:t>
+      </w:r>
+    </w:p>
+    <w:p>
+      <w:pPr>
+        <w:widowControl/>
+        <w:spacing w:line="240" w:lineRule="auto" w:after="0" w:before="0"/>
+        <w:ind w:firstLine="0" w:left="198" w:right="113"/>
+        <w:shd w:val="clear" w:fill="F5F5F5" w:color="auto"/>
+        <w:pBdr>
+          <w:left w:val="single" w:sz="4" w:space="1" w:color="D9D9D9"/>
+          <w:right w:val="single" w:sz="4" w:space="1" w:color="D9D9D9"/>
+        </w:pBdr>
+      </w:pPr>
+      <w:r>
+        <w:rPr>
+          <w:rFonts w:ascii="Consolas" w:hAnsi="Consolas"/>
+          <w:sz w:val="17"/>
+        </w:rPr>
+        <w:t>@admin.register(Term)</w:t>
+      </w:r>
+    </w:p>
+    <w:p>
+      <w:pPr>
+        <w:widowControl/>
+        <w:spacing w:line="240" w:lineRule="auto" w:after="0" w:before="0"/>
+        <w:ind w:firstLine="0" w:left="198" w:right="113"/>
+        <w:shd w:val="clear" w:fill="F5F5F5" w:color="auto"/>
+        <w:pBdr>
+          <w:left w:val="single" w:sz="4" w:space="1" w:color="D9D9D9"/>
+          <w:right w:val="single" w:sz="4" w:space="1" w:color="D9D9D9"/>
+        </w:pBdr>
+      </w:pPr>
+      <w:r>
+        <w:rPr>
+          <w:rFonts w:ascii="Consolas" w:hAnsi="Consolas"/>
+          <w:sz w:val="17"/>
+        </w:rPr>
+        <w:t>class TermAdmin(admin.ModelAdmin):</w:t>
+      </w:r>
+    </w:p>
+    <w:p>
+      <w:pPr>
+        <w:widowControl/>
+        <w:spacing w:line="240" w:lineRule="auto" w:after="0" w:before="0"/>
+        <w:ind w:firstLine="0" w:left="198" w:right="113"/>
+        <w:shd w:val="clear" w:fill="F5F5F5" w:color="auto"/>
+        <w:pBdr>
+          <w:left w:val="single" w:sz="4" w:space="1" w:color="D9D9D9"/>
+          <w:right w:val="single" w:sz="4" w:space="1" w:color="D9D9D9"/>
+        </w:pBdr>
+      </w:pPr>
+      <w:r>
+        <w:rPr>
+          <w:rFonts w:ascii="Consolas" w:hAnsi="Consolas"/>
+          <w:sz w:val="17"/>
+        </w:rPr>
+        <w:t xml:space="preserve">    list_display = ("term", "category", "source", "updated_at")</w:t>
+      </w:r>
+    </w:p>
+    <w:p>
+      <w:pPr>
+        <w:widowControl/>
+        <w:spacing w:line="240" w:lineRule="auto" w:after="0" w:before="0"/>
+        <w:ind w:firstLine="0" w:left="198" w:right="113"/>
+        <w:shd w:val="clear" w:fill="F5F5F5" w:color="auto"/>
+        <w:pBdr>
+          <w:left w:val="single" w:sz="4" w:space="1" w:color="D9D9D9"/>
+          <w:right w:val="single" w:sz="4" w:space="1" w:color="D9D9D9"/>
+        </w:pBdr>
+      </w:pPr>
+      <w:r>
+        <w:rPr>
+          <w:rFonts w:ascii="Consolas" w:hAnsi="Consolas"/>
+          <w:sz w:val="17"/>
+        </w:rPr>
+        <w:t xml:space="preserve">    list_filter = ("category",)</w:t>
+      </w:r>
+    </w:p>
+    <w:p>
+      <w:pPr>
+        <w:widowControl/>
+        <w:spacing w:line="240" w:lineRule="auto" w:after="0" w:before="0"/>
+        <w:ind w:firstLine="0" w:left="198" w:right="113"/>
+        <w:shd w:val="clear" w:fill="F5F5F5" w:color="auto"/>
+        <w:pBdr>
+          <w:left w:val="single" w:sz="4" w:space="1" w:color="D9D9D9"/>
+          <w:right w:val="single" w:sz="4" w:space="1" w:color="D9D9D9"/>
+        </w:pBdr>
+      </w:pPr>
+      <w:r>
+        <w:rPr>
+          <w:rFonts w:ascii="Consolas" w:hAnsi="Consolas"/>
+          <w:sz w:val="17"/>
+        </w:rPr>
+        <w:t xml:space="preserve">    search_fields = ("term", "short_definition", "full_definition", "synonyms")</w:t>
+      </w:r>
+    </w:p>
+    <w:p>
+      <w:pPr>
+        <w:widowControl/>
+        <w:spacing w:line="240" w:lineRule="auto" w:after="0" w:before="0"/>
+        <w:ind w:firstLine="0" w:left="198" w:right="113"/>
+        <w:shd w:val="clear" w:fill="F5F5F5" w:color="auto"/>
+        <w:pBdr>
+          <w:left w:val="single" w:sz="4" w:space="1" w:color="D9D9D9"/>
+          <w:right w:val="single" w:sz="4" w:space="1" w:color="D9D9D9"/>
+        </w:pBdr>
+      </w:pPr>
+      <w:r>
+        <w:rPr>
+          <w:rFonts w:ascii="Consolas" w:hAnsi="Consolas"/>
+          <w:sz w:val="17"/>
+        </w:rPr>
+        <w:t xml:space="preserve">    prepopulated_fields = {"slug": ("term",)}</w:t>
+      </w:r>
+    </w:p>
+    <w:p>
+      <w:pPr>
+        <w:widowControl/>
+        <w:spacing w:line="240" w:lineRule="auto" w:after="0" w:before="0"/>
+        <w:ind w:firstLine="0" w:left="198" w:right="113"/>
+        <w:shd w:val="clear" w:fill="F5F5F5" w:color="auto"/>
+        <w:pBdr>
+          <w:left w:val="single" w:sz="4" w:space="1" w:color="D9D9D9"/>
+          <w:right w:val="single" w:sz="4" w:space="1" w:color="D9D9D9"/>
+        </w:pBdr>
+      </w:pPr>
+      <w:r>
+        <w:rPr>
+          <w:rFonts w:ascii="Consolas" w:hAnsi="Consolas"/>
+          <w:sz w:val="17"/>
+        </w:rPr>
+        <w:t xml:space="preserve"> </w:t>
+      </w:r>
+    </w:p>
+    <w:p>
+      <w:pPr>
+        <w:widowControl/>
+        <w:spacing w:line="240" w:lineRule="auto" w:after="0" w:before="0"/>
+        <w:ind w:firstLine="0" w:left="198" w:right="113"/>
+        <w:shd w:val="clear" w:fill="F5F5F5" w:color="auto"/>
+        <w:pBdr>
+          <w:left w:val="single" w:sz="4" w:space="1" w:color="D9D9D9"/>
+          <w:right w:val="single" w:sz="4" w:space="1" w:color="D9D9D9"/>
+        </w:pBdr>
+      </w:pPr>
+      <w:r>
+        <w:rPr>
+          <w:rFonts w:ascii="Consolas" w:hAnsi="Consolas"/>
+          <w:sz w:val="17"/>
+        </w:rPr>
+        <w:t>@admin.register(UserSuggestion)</w:t>
+      </w:r>
+    </w:p>
+    <w:p>
+      <w:pPr>
+        <w:widowControl/>
+        <w:spacing w:line="240" w:lineRule="auto" w:after="0" w:before="0"/>
+        <w:ind w:firstLine="0" w:left="198" w:right="113"/>
+        <w:shd w:val="clear" w:fill="F5F5F5" w:color="auto"/>
+        <w:pBdr>
+          <w:left w:val="single" w:sz="4" w:space="1" w:color="D9D9D9"/>
+          <w:right w:val="single" w:sz="4" w:space="1" w:color="D9D9D9"/>
+        </w:pBdr>
+      </w:pPr>
+      <w:r>
+        <w:rPr>
+          <w:rFonts w:ascii="Consolas" w:hAnsi="Consolas"/>
+          <w:sz w:val="17"/>
+        </w:rPr>
+        <w:t>class UserSuggestionAdmin(admin.ModelAdmin):</w:t>
+      </w:r>
+    </w:p>
+    <w:p>
+      <w:pPr>
+        <w:widowControl/>
+        <w:spacing w:line="240" w:lineRule="auto" w:after="0" w:before="0"/>
+        <w:ind w:firstLine="0" w:left="198" w:right="113"/>
+        <w:shd w:val="clear" w:fill="F5F5F5" w:color="auto"/>
+        <w:pBdr>
+          <w:left w:val="single" w:sz="4" w:space="1" w:color="D9D9D9"/>
+          <w:right w:val="single" w:sz="4" w:space="1" w:color="D9D9D9"/>
+        </w:pBdr>
+      </w:pPr>
+      <w:r>
+        <w:rPr>
+          <w:rFonts w:ascii="Consolas" w:hAnsi="Consolas"/>
+          <w:sz w:val="17"/>
+        </w:rPr>
+        <w:t xml:space="preserve">    list_display = ("candidate_term", "contact_email", "status", "created_at")</w:t>
+      </w:r>
+    </w:p>
+    <w:p>
+      <w:pPr>
+        <w:widowControl/>
+        <w:spacing w:line="240" w:lineRule="auto" w:after="0" w:before="0"/>
+        <w:ind w:firstLine="0" w:left="198" w:right="113"/>
+        <w:shd w:val="clear" w:fill="F5F5F5" w:color="auto"/>
+        <w:pBdr>
+          <w:left w:val="single" w:sz="4" w:space="1" w:color="D9D9D9"/>
+          <w:right w:val="single" w:sz="4" w:space="1" w:color="D9D9D9"/>
+        </w:pBdr>
+      </w:pPr>
+      <w:r>
+        <w:rPr>
+          <w:rFonts w:ascii="Consolas" w:hAnsi="Consolas"/>
+          <w:sz w:val="17"/>
+        </w:rPr>
+        <w:t xml:space="preserve">    list_filter = ("status",)</w:t>
+      </w:r>
+    </w:p>
+    <w:p>
+      <w:pPr>
+        <w:widowControl/>
+        <w:spacing w:line="240" w:lineRule="auto" w:after="0" w:before="0"/>
+        <w:ind w:firstLine="0" w:left="198" w:right="113"/>
+        <w:shd w:val="clear" w:fill="F5F5F5" w:color="auto"/>
+        <w:pBdr>
+          <w:left w:val="single" w:sz="4" w:space="1" w:color="D9D9D9"/>
+          <w:right w:val="single" w:sz="4" w:space="1" w:color="D9D9D9"/>
+        </w:pBdr>
+      </w:pPr>
+      <w:r>
+        <w:rPr>
+          <w:rFonts w:ascii="Consolas" w:hAnsi="Consolas"/>
+          <w:sz w:val="17"/>
+        </w:rPr>
+        <w:t xml:space="preserve">    search_fields = ("candidate_term", "candidate_definition", "contact_email")</w:t>
+      </w:r>
+    </w:p>
+    <w:p>
+      <w:pPr>
+        <w:spacing w:before="60" w:after="120" w:line="276" w:lineRule="auto"/>
+        <w:ind w:firstLine="0" w:left="0"/>
+      </w:pPr>
+      <w:r>
+        <w:t>Лістинг ілюструє налаштування Django Admin для швидкого пошуку, фільтрації та модерації контенту.</w:t>
+      </w:r>
+    </w:p>
+    <w:p>
+      <w:pPr>
+        <w:pStyle w:val="Heading2"/>
+        <w:keepNext w:val="0"/>
+        <w:pageBreakBefore w:val="0"/>
+        <w:jc w:val="left"/>
+      </w:pPr>
+      <w:r>
+        <w:rPr>
+          <w:b/>
+        </w:rPr>
+        <w:t>ІЛЮСТРАЦІЇ ІНТЕРФЕЙСУ</w:t>
+      </w:r>
+    </w:p>
+    <w:p>
+      <w:pPr>
+        <w:ind w:firstLine="0"/>
+      </w:pPr>
+      <w:r>
+        <w:t>Нижче наведено скріншоти реалізованого користувацького інтерфейсу та контуру адміністративної підсистеми Django Admin.</w:t>
+      </w:r>
+    </w:p>
+    <w:p>
+      <w:pPr>
+        <w:jc w:val="center"/>
+      </w:pPr>
+      <w:r>
+        <w:drawing>
+          <wp:inline xmlns:a="http://schemas.openxmlformats.org/drawingml/2006/main" xmlns:pic="http://schemas.openxmlformats.org/drawingml/2006/picture">
+            <wp:extent cx="5580000" cy="6293233"/>
+            <wp:docPr id="3" name="Picture 3"/>
+            <wp:cNvGraphicFramePr>
+              <a:graphicFrameLocks noChangeAspect="1"/>
+            </wp:cNvGraphicFramePr>
+            <a:graphic>
+              <a:graphicData uri="http://schemas.openxmlformats.org/drawingml/2006/picture">
+                <pic:pic>
+                  <pic:nvPicPr>
+                    <pic:cNvPr id="0" name="Рисунок 3.2 – Реалізована головна сторінка вебсловника.png"/>
+                    <pic:cNvPicPr/>
+                  </pic:nvPicPr>
+                  <pic:blipFill>
+                    <a:blip r:embed="rId12"/>
+                    <a:stretch>
+                      <a:fillRect/>
+                    </a:stretch>
+                  </pic:blipFill>
+                  <pic:spPr>
+                    <a:xfrm>
+                      <a:off x="0" y="0"/>
+                      <a:ext cx="5580000" cy="6293233"/>
+                    </a:xfrm>
+                    <a:prstGeom prst="rect"/>
+                  </pic:spPr>
+                </pic:pic>
+              </a:graphicData>
+            </a:graphic>
+          </wp:inline>
+        </w:drawing>
+      </w:r>
+    </w:p>
+    <w:p>
+      <w:pPr>
+        <w:jc w:val="center"/>
+      </w:pPr>
+      <w:r>
+        <w:t>Рисунок В.1 - Реалізована головна сторінка вебсловника</w:t>
+      </w:r>
+    </w:p>
+    <w:p>
+      <w:pPr>
+        <w:jc w:val="center"/>
+      </w:pPr>
+      <w:r>
+        <w:drawing>
+          <wp:inline xmlns:a="http://schemas.openxmlformats.org/drawingml/2006/main" xmlns:pic="http://schemas.openxmlformats.org/drawingml/2006/picture">
+            <wp:extent cx="5580000" cy="2844997"/>
+            <wp:docPr id="4" name="Picture 4"/>
+            <wp:cNvGraphicFramePr>
+              <a:graphicFrameLocks noChangeAspect="1"/>
+            </wp:cNvGraphicFramePr>
+            <a:graphic>
+              <a:graphicData uri="http://schemas.openxmlformats.org/drawingml/2006/picture">
+                <pic:pic>
+                  <pic:nvPicPr>
+                    <pic:cNvPr id="0" name="Рисунок 3.3 – Реалізована сторінка каталогу термінів і пошуку.png"/>
+                    <pic:cNvPicPr/>
+                  </pic:nvPicPr>
+                  <pic:blipFill>
+                    <a:blip r:embed="rId13"/>
+                    <a:stretch>
+                      <a:fillRect/>
+                    </a:stretch>
+                  </pic:blipFill>
+                  <pic:spPr>
+                    <a:xfrm>
+                      <a:off x="0" y="0"/>
+                      <a:ext cx="5580000" cy="2844997"/>
+                    </a:xfrm>
+                    <a:prstGeom prst="rect"/>
+                  </pic:spPr>
+                </pic:pic>
+              </a:graphicData>
+            </a:graphic>
+          </wp:inline>
+        </w:drawing>
+      </w:r>
+    </w:p>
+    <w:p>
+      <w:pPr>
+        <w:jc w:val="center"/>
+      </w:pPr>
+      <w:r>
+        <w:t>Рисунок В.2 - Реалізована сторінка каталогу термінів і пошуку</w:t>
+      </w:r>
+    </w:p>
+    <w:p>
+      <w:pPr>
+        <w:jc w:val="center"/>
+      </w:pPr>
+      <w:r>
+        <w:drawing>
+          <wp:inline xmlns:a="http://schemas.openxmlformats.org/drawingml/2006/main" xmlns:pic="http://schemas.openxmlformats.org/drawingml/2006/picture">
+            <wp:extent cx="5580000" cy="2638949"/>
+            <wp:docPr id="5" name="Picture 5"/>
+            <wp:cNvGraphicFramePr>
+              <a:graphicFrameLocks noChangeAspect="1"/>
+            </wp:cNvGraphicFramePr>
+            <a:graphic>
+              <a:graphicData uri="http://schemas.openxmlformats.org/drawingml/2006/picture">
+                <pic:pic>
+                  <pic:nvPicPr>
+                    <pic:cNvPr id="0" name="Рисунок 3.4 – Реалізована сторінка картки терміна.png"/>
+                    <pic:cNvPicPr/>
+                  </pic:nvPicPr>
+                  <pic:blipFill>
+                    <a:blip r:embed="rId14"/>
+                    <a:stretch>
+                      <a:fillRect/>
+                    </a:stretch>
+                  </pic:blipFill>
+                  <pic:spPr>
+                    <a:xfrm>
+                      <a:off x="0" y="0"/>
+                      <a:ext cx="5580000" cy="2638949"/>
+                    </a:xfrm>
+                    <a:prstGeom prst="rect"/>
+                  </pic:spPr>
+                </pic:pic>
+              </a:graphicData>
+            </a:graphic>
+          </wp:inline>
+        </w:drawing>
+      </w:r>
+    </w:p>
+    <w:p>
+      <w:pPr>
+        <w:jc w:val="center"/>
+      </w:pPr>
+      <w:r>
+        <w:t>Рисунок В.3 - Реалізована сторінка картки терміна</w:t>
+      </w:r>
+    </w:p>
+    <w:p>
+      <w:pPr>
+        <w:jc w:val="center"/>
+      </w:pPr>
+      <w:r>
+        <w:drawing>
+          <wp:inline xmlns:a="http://schemas.openxmlformats.org/drawingml/2006/main" xmlns:pic="http://schemas.openxmlformats.org/drawingml/2006/picture">
+            <wp:extent cx="5580000" cy="4763263"/>
+            <wp:docPr id="6" name="Picture 6"/>
+            <wp:cNvGraphicFramePr>
+              <a:graphicFrameLocks noChangeAspect="1"/>
+            </wp:cNvGraphicFramePr>
+            <a:graphic>
+              <a:graphicData uri="http://schemas.openxmlformats.org/drawingml/2006/picture">
+                <pic:pic>
+                  <pic:nvPicPr>
+                    <pic:cNvPr id="0" name="Рисунок 3.5 — контур админ-подсистемы.png"/>
+                    <pic:cNvPicPr/>
+                  </pic:nvPicPr>
+                  <pic:blipFill>
+                    <a:blip r:embed="rId15"/>
+                    <a:stretch>
+                      <a:fillRect/>
+                    </a:stretch>
+                  </pic:blipFill>
+                  <pic:spPr>
+                    <a:xfrm>
+                      <a:off x="0" y="0"/>
+                      <a:ext cx="5580000" cy="4763263"/>
+                    </a:xfrm>
+                    <a:prstGeom prst="rect"/>
+                  </pic:spPr>
+                </pic:pic>
+              </a:graphicData>
+            </a:graphic>
+          </wp:inline>
+        </w:drawing>
+      </w:r>
+    </w:p>
+    <w:p>
+      <w:pPr>
+        <w:jc w:val="center"/>
+      </w:pPr>
+      <w:r>
+        <w:t>Рисунок В.4 - Реалізований інтерфейс адміністративної підсистеми (Django Admin)</w:t>
       </w:r>
     </w:p>
     <w:p>
@@ -231,6 +2720,134 @@
         <w:rPr>
           <w:b/>
         </w:rPr>
+        <w:t>ДОДАТОК Г</w:t>
+      </w:r>
+    </w:p>
+    <w:p>
+      <w:pPr>
+        <w:pStyle w:val="Heading2"/>
+        <w:keepNext w:val="0"/>
+        <w:pageBreakBefore w:val="0"/>
+        <w:jc w:val="left"/>
+      </w:pPr>
+      <w:r>
+        <w:rPr>
+          <w:b/>
+        </w:rPr>
+        <w:t>ПУБЛІЧНИЙ РЕПОЗИТОРІЙ ВИХІДНОГО КОДУ ВЕБЗАСТОСУНКУ</w:t>
+      </w:r>
+    </w:p>
+    <w:p>
+      <w:pPr>
+        <w:ind w:firstLine="0"/>
+      </w:pPr>
+      <w:r>
+        <w:t>Вихідний код вебзастосунку, тестові дані, залежності та інструкція запуску опубліковані в окремому відкритому репозиторії GitHub.</w:t>
+      </w:r>
+    </w:p>
+    <w:p>
+      <w:pPr>
+        <w:ind w:firstLine="0"/>
+      </w:pPr>
+      <w:r>
+        <w:t>Публікація забезпечує відтворюваність результатів розробки, дозволяє перевірити структуру проєкту, моделі даних, шаблони, статичні ресурси та сценарії розгортання без передачі повного архіву окремими файлами.</w:t>
+      </w:r>
+    </w:p>
+    <w:p>
+      <w:pPr>
+        <w:ind w:firstLine="0"/>
+      </w:pPr>
+      <w:r>
+        <w:t>Репозиторій: Mazjet/Thesis_public</w:t>
+      </w:r>
+    </w:p>
+    <w:p>
+      <w:pPr>
+        <w:ind w:firstLine="0"/>
+      </w:pPr>
+      <w:r>
+        <w:t>Адреса: https://github.com/Mazjet/Thesis_public</w:t>
+      </w:r>
+    </w:p>
+    <w:p>
+      <w:pPr>
+        <w:ind w:firstLine="0"/>
+      </w:pPr>
+      <w:r>
+        <w:t>У репозиторії зокрема: каталоги `dictionary/`, `dictionary_site/`, `templates/`, `static/`, фікстури `dictionary/fixtures/`, файл `requirements.txt`, `README.md`, утиліта `scripts/validate_terms_import.py`.</w:t>
+      </w:r>
+    </w:p>
+    <w:p>
+      <w:pPr>
+        <w:jc w:val="center"/>
+      </w:pPr>
+      <w:r>
+        <w:drawing>
+          <wp:inline xmlns:a="http://schemas.openxmlformats.org/drawingml/2006/main" xmlns:pic="http://schemas.openxmlformats.org/drawingml/2006/picture">
+            <wp:extent cx="5580000" cy="5580000"/>
+            <wp:docPr id="7" name="Picture 7"/>
+            <wp:cNvGraphicFramePr>
+              <a:graphicFrameLocks noChangeAspect="1"/>
+            </wp:cNvGraphicFramePr>
+            <a:graphic>
+              <a:graphicData uri="http://schemas.openxmlformats.org/drawingml/2006/picture">
+                <pic:pic>
+                  <pic:nvPicPr>
+                    <pic:cNvPr id="0" name="appendix_github_qr.png"/>
+                    <pic:cNvPicPr/>
+                  </pic:nvPicPr>
+                  <pic:blipFill>
+                    <a:blip r:embed="rId16"/>
+                    <a:stretch>
+                      <a:fillRect/>
+                    </a:stretch>
+                  </pic:blipFill>
+                  <pic:spPr>
+                    <a:xfrm>
+                      <a:off x="0" y="0"/>
+                      <a:ext cx="5580000" cy="5580000"/>
+                    </a:xfrm>
+                    <a:prstGeom prst="rect"/>
+                  </pic:spPr>
+                </pic:pic>
+              </a:graphicData>
+            </a:graphic>
+          </wp:inline>
+        </w:drawing>
+      </w:r>
+    </w:p>
+    <w:p>
+      <w:pPr>
+        <w:jc w:val="center"/>
+      </w:pPr>
+      <w:r>
+        <w:t>Рисунок Г.1 - QR-код посилання на публічний репозиторій проєкту</w:t>
+      </w:r>
+    </w:p>
+    <w:p>
+      <w:pPr>
+        <w:ind w:firstLine="0"/>
+      </w:pPr>
+      <w:r>
+        <w:t>QR-код дублює адресу репозиторію для швидкого відкриття з мобільного пристрою під час демонстрації.</w:t>
+      </w:r>
+    </w:p>
+    <w:p>
+      <w:r>
+        <w:br w:type="page"/>
+      </w:r>
+    </w:p>
+    <w:p>
+      <w:pPr>
+        <w:pStyle w:val="Heading1"/>
+        <w:keepNext w:val="0"/>
+        <w:pageBreakBefore w:val="0"/>
+        <w:jc w:val="center"/>
+      </w:pPr>
+      <w:r>
+        <w:rPr>
+          <w:b/>
+        </w:rPr>
         <w:t>ДОДАТОК Д</w:t>
       </w:r>
     </w:p>
@@ -249,48 +2866,97 @@
       </w:r>
     </w:p>
     <w:p>
+      <w:pPr>
+        <w:ind w:firstLine="0"/>
+      </w:pPr>
+      <w:r>
+        <w:t>У додатку наведено базову послідовність запуску проєкту в локальному середовищі Windows з використанням віртуального оточення Python.</w:t>
+      </w:r>
+    </w:p>
+    <w:p>
+      <w:pPr>
+        <w:ind w:firstLine="0"/>
+      </w:pPr>
       <w:r>
         <w:t>1) python -m venv .venv</w:t>
       </w:r>
     </w:p>
     <w:p>
+      <w:pPr>
+        <w:ind w:firstLine="0"/>
+      </w:pPr>
       <w:r>
         <w:t>2) .venv\Scripts\python -m pip install -r requirements.txt</w:t>
       </w:r>
     </w:p>
     <w:p>
+      <w:pPr>
+        <w:ind w:firstLine="0"/>
+      </w:pPr>
       <w:r>
         <w:t>3) .venv\Scripts\python manage.py migrate</w:t>
       </w:r>
     </w:p>
     <w:p>
+      <w:pPr>
+        <w:ind w:firstLine="0"/>
+      </w:pPr>
       <w:r>
         <w:t>4) .venv\Scripts\python manage.py loaddata dictionary/fixtures/initial_data.json</w:t>
       </w:r>
     </w:p>
     <w:p>
-      <w:r>
-        <w:t>4a) (опціонально) .venv\Scripts\python manage.py loaddata dictionary/fixtures/terms_batch_01.json</w:t>
-      </w:r>
-    </w:p>
-    <w:p>
-      <w:r>
-        <w:t>4b) (опціонально) .venv\Scripts\python manage.py loaddata dictionary/fixtures/terms_batch_02.json</w:t>
-      </w:r>
-    </w:p>
-    <w:p>
-      <w:r>
-        <w:t>4c) (опціонально) перед імпортом з CSV/JSON: .venv\Scripts\python scripts/validate_terms_import.py &lt;шлях_до_файлу&gt;</w:t>
-      </w:r>
-    </w:p>
-    <w:p>
+      <w:pPr>
+        <w:ind w:firstLine="0"/>
+      </w:pPr>
       <w:r>
         <w:t>5) .venv\Scripts\python manage.py runserver</w:t>
       </w:r>
     </w:p>
     <w:p>
+      <w:pPr>
+        <w:ind w:firstLine="0"/>
+      </w:pPr>
       <w:r>
-        <w:t>6) Перехід у браузері за адресою http://127.0.0.1:8000/</w:t>
+        <w:t>6) Відкрити в браузері http://127.0.0.1:8000/</w:t>
+      </w:r>
+    </w:p>
+    <w:p>
+      <w:pPr>
+        <w:pStyle w:val="Heading2"/>
+        <w:keepNext w:val="0"/>
+        <w:pageBreakBefore w:val="0"/>
+        <w:jc w:val="left"/>
+      </w:pPr>
+      <w:r>
+        <w:rPr>
+          <w:b/>
+        </w:rPr>
+        <w:t>ОПЦІОНАЛЬНІ КРОКИ</w:t>
+      </w:r>
+    </w:p>
+    <w:p>
+      <w:pPr>
+        <w:ind w:firstLine="0"/>
+      </w:pPr>
+      <w:r>
+        <w:t>а) додаткове завантаження демонстраційних термінів: .venv\Scripts\python manage.py loaddata dictionary/fixtures/terms_batch_01.json</w:t>
+      </w:r>
+    </w:p>
+    <w:p>
+      <w:pPr>
+        <w:ind w:firstLine="0"/>
+      </w:pPr>
+      <w:r>
+        <w:t>б) додаткове завантаження другої порції: .venv\Scripts\python manage.py loaddata dictionary/fixtures/terms_batch_02.json</w:t>
+      </w:r>
+    </w:p>
+    <w:p>
+      <w:pPr>
+        <w:ind w:firstLine="0"/>
+      </w:pPr>
+      <w:r>
+        <w:t>в) перевірка файлу імпорту перед завантаженням: .venv\Scripts\python scripts\validate_terms_import.py &lt;шлях_до_файлу&gt;</w:t>
       </w:r>
     </w:p>
     <w:p>
@@ -327,18 +2993,612 @@
       </w:r>
     </w:p>
     <w:p>
+      <w:pPr>
+        <w:ind w:firstLine="0"/>
+      </w:pPr>
       <w:r>
-        <w:t>Табл. Е.1 - результати виконання автоматизованих тестів.</w:t>
+        <w:t>У додатку узагальнено результати перевірки ключових сценаріїв роботи системи за допомогою автоматизованих тестів Django.</w:t>
       </w:r>
     </w:p>
     <w:p>
       <w:r>
-        <w:t>Перевірено доступність ключових сторінок, пошук, картку терміна та форму пропозицій.</w:t>
+        <w:t>Таблиця Е.1 - Результати перевірки базових сценаріїв</w:t>
       </w:r>
     </w:p>
+    <w:tbl>
+      <w:tblPr>
+        <w:tblStyle w:val="TableGrid"/>
+        <w:tblW w:type="auto" w:w="0"/>
+        <w:tblLayout w:type="autofit"/>
+        <w:tblLook w:firstColumn="1" w:firstRow="1" w:lastColumn="0" w:lastRow="0" w:noHBand="0" w:noVBand="1" w:val="04A0"/>
+      </w:tblPr>
+      <w:tblGrid>
+        <w:gridCol w:w="2493"/>
+        <w:gridCol w:w="2493"/>
+        <w:gridCol w:w="2493"/>
+        <w:gridCol w:w="2493"/>
+      </w:tblGrid>
+      <w:tr>
+        <w:tc>
+          <w:tcPr>
+            <w:tcW w:type="dxa" w:w="2493"/>
+            <w:tcMar>
+              <w:top w:w="40" w:type="dxa"/>
+              <w:start w:w="90" w:type="dxa"/>
+              <w:bottom w:w="40" w:type="dxa"/>
+              <w:end w:w="90" w:type="dxa"/>
+            </w:tcMar>
+          </w:tcPr>
+          <w:p>
+            <w:pPr>
+              <w:spacing w:before="0" w:after="0" w:line="240" w:lineRule="auto"/>
+              <w:ind w:firstLine="0"/>
+            </w:pPr>
+            <w:r>
+              <w:t>Сценарій</w:t>
+            </w:r>
+          </w:p>
+        </w:tc>
+        <w:tc>
+          <w:tcPr>
+            <w:tcW w:type="dxa" w:w="2493"/>
+            <w:tcMar>
+              <w:top w:w="40" w:type="dxa"/>
+              <w:start w:w="90" w:type="dxa"/>
+              <w:bottom w:w="40" w:type="dxa"/>
+              <w:end w:w="90" w:type="dxa"/>
+            </w:tcMar>
+          </w:tcPr>
+          <w:p>
+            <w:pPr>
+              <w:spacing w:before="0" w:after="0" w:line="240" w:lineRule="auto"/>
+              <w:ind w:firstLine="0"/>
+            </w:pPr>
+            <w:r>
+              <w:t>Очікуваний результат</w:t>
+            </w:r>
+          </w:p>
+        </w:tc>
+        <w:tc>
+          <w:tcPr>
+            <w:tcW w:type="dxa" w:w="2493"/>
+            <w:tcMar>
+              <w:top w:w="40" w:type="dxa"/>
+              <w:start w:w="90" w:type="dxa"/>
+              <w:bottom w:w="40" w:type="dxa"/>
+              <w:end w:w="90" w:type="dxa"/>
+            </w:tcMar>
+          </w:tcPr>
+          <w:p>
+            <w:pPr>
+              <w:spacing w:before="0" w:after="0" w:line="240" w:lineRule="auto"/>
+              <w:ind w:firstLine="0"/>
+            </w:pPr>
+            <w:r>
+              <w:t>Фактичний результат</w:t>
+            </w:r>
+          </w:p>
+        </w:tc>
+        <w:tc>
+          <w:tcPr>
+            <w:tcW w:type="dxa" w:w="2493"/>
+            <w:tcMar>
+              <w:top w:w="40" w:type="dxa"/>
+              <w:start w:w="90" w:type="dxa"/>
+              <w:bottom w:w="40" w:type="dxa"/>
+              <w:end w:w="90" w:type="dxa"/>
+            </w:tcMar>
+          </w:tcPr>
+          <w:p>
+            <w:pPr>
+              <w:spacing w:before="0" w:after="0" w:line="240" w:lineRule="auto"/>
+              <w:ind w:firstLine="0"/>
+            </w:pPr>
+            <w:r>
+              <w:t>Статус</w:t>
+            </w:r>
+          </w:p>
+        </w:tc>
+      </w:tr>
+      <w:tr>
+        <w:tc>
+          <w:tcPr>
+            <w:tcW w:type="dxa" w:w="2493"/>
+            <w:tcMar>
+              <w:top w:w="40" w:type="dxa"/>
+              <w:start w:w="90" w:type="dxa"/>
+              <w:bottom w:w="40" w:type="dxa"/>
+              <w:end w:w="90" w:type="dxa"/>
+            </w:tcMar>
+          </w:tcPr>
+          <w:p>
+            <w:pPr>
+              <w:spacing w:before="0" w:after="0" w:line="240" w:lineRule="auto"/>
+              <w:ind w:firstLine="0"/>
+            </w:pPr>
+            <w:r>
+              <w:t>Головна сторінка (GET /)</w:t>
+            </w:r>
+          </w:p>
+        </w:tc>
+        <w:tc>
+          <w:tcPr>
+            <w:tcW w:type="dxa" w:w="2493"/>
+            <w:tcMar>
+              <w:top w:w="40" w:type="dxa"/>
+              <w:start w:w="90" w:type="dxa"/>
+              <w:bottom w:w="40" w:type="dxa"/>
+              <w:end w:w="90" w:type="dxa"/>
+            </w:tcMar>
+          </w:tcPr>
+          <w:p>
+            <w:pPr>
+              <w:spacing w:before="0" w:after="0" w:line="240" w:lineRule="auto"/>
+              <w:ind w:firstLine="0"/>
+            </w:pPr>
+            <w:r>
+              <w:t>HTTP 200, коректний рендер шаблону</w:t>
+            </w:r>
+          </w:p>
+        </w:tc>
+        <w:tc>
+          <w:tcPr>
+            <w:tcW w:type="dxa" w:w="2493"/>
+            <w:tcMar>
+              <w:top w:w="40" w:type="dxa"/>
+              <w:start w:w="90" w:type="dxa"/>
+              <w:bottom w:w="40" w:type="dxa"/>
+              <w:end w:w="90" w:type="dxa"/>
+            </w:tcMar>
+          </w:tcPr>
+          <w:p>
+            <w:pPr>
+              <w:spacing w:before="0" w:after="0" w:line="240" w:lineRule="auto"/>
+              <w:ind w:firstLine="0"/>
+            </w:pPr>
+            <w:r>
+              <w:t>Сторінка відкривається без помилок</w:t>
+            </w:r>
+          </w:p>
+        </w:tc>
+        <w:tc>
+          <w:tcPr>
+            <w:tcW w:type="dxa" w:w="2493"/>
+            <w:tcMar>
+              <w:top w:w="40" w:type="dxa"/>
+              <w:start w:w="90" w:type="dxa"/>
+              <w:bottom w:w="40" w:type="dxa"/>
+              <w:end w:w="90" w:type="dxa"/>
+            </w:tcMar>
+          </w:tcPr>
+          <w:p>
+            <w:pPr>
+              <w:spacing w:before="0" w:after="0" w:line="240" w:lineRule="auto"/>
+              <w:ind w:firstLine="0"/>
+            </w:pPr>
+            <w:r>
+              <w:t>Успішно</w:t>
+            </w:r>
+          </w:p>
+        </w:tc>
+      </w:tr>
+      <w:tr>
+        <w:tc>
+          <w:tcPr>
+            <w:tcW w:type="dxa" w:w="2493"/>
+            <w:tcMar>
+              <w:top w:w="40" w:type="dxa"/>
+              <w:start w:w="90" w:type="dxa"/>
+              <w:bottom w:w="40" w:type="dxa"/>
+              <w:end w:w="90" w:type="dxa"/>
+            </w:tcMar>
+          </w:tcPr>
+          <w:p>
+            <w:pPr>
+              <w:spacing w:before="0" w:after="0" w:line="240" w:lineRule="auto"/>
+              <w:ind w:firstLine="0"/>
+            </w:pPr>
+            <w:r>
+              <w:t>Пошук терміна (GET /terms/?q=...)</w:t>
+            </w:r>
+          </w:p>
+        </w:tc>
+        <w:tc>
+          <w:tcPr>
+            <w:tcW w:type="dxa" w:w="2493"/>
+            <w:tcMar>
+              <w:top w:w="40" w:type="dxa"/>
+              <w:start w:w="90" w:type="dxa"/>
+              <w:bottom w:w="40" w:type="dxa"/>
+              <w:end w:w="90" w:type="dxa"/>
+            </w:tcMar>
+          </w:tcPr>
+          <w:p>
+            <w:pPr>
+              <w:spacing w:before="0" w:after="0" w:line="240" w:lineRule="auto"/>
+              <w:ind w:firstLine="0"/>
+            </w:pPr>
+            <w:r>
+              <w:t>Релевантна видача або повідомлення про відсутність збігів</w:t>
+            </w:r>
+          </w:p>
+        </w:tc>
+        <w:tc>
+          <w:tcPr>
+            <w:tcW w:type="dxa" w:w="2493"/>
+            <w:tcMar>
+              <w:top w:w="40" w:type="dxa"/>
+              <w:start w:w="90" w:type="dxa"/>
+              <w:bottom w:w="40" w:type="dxa"/>
+              <w:end w:w="90" w:type="dxa"/>
+            </w:tcMar>
+          </w:tcPr>
+          <w:p>
+            <w:pPr>
+              <w:spacing w:before="0" w:after="0" w:line="240" w:lineRule="auto"/>
+              <w:ind w:firstLine="0"/>
+            </w:pPr>
+            <w:r>
+              <w:t>Пошук і фільтрація відпрацьовують передбачувано</w:t>
+            </w:r>
+          </w:p>
+        </w:tc>
+        <w:tc>
+          <w:tcPr>
+            <w:tcW w:type="dxa" w:w="2493"/>
+            <w:tcMar>
+              <w:top w:w="40" w:type="dxa"/>
+              <w:start w:w="90" w:type="dxa"/>
+              <w:bottom w:w="40" w:type="dxa"/>
+              <w:end w:w="90" w:type="dxa"/>
+            </w:tcMar>
+          </w:tcPr>
+          <w:p>
+            <w:pPr>
+              <w:spacing w:before="0" w:after="0" w:line="240" w:lineRule="auto"/>
+              <w:ind w:firstLine="0"/>
+            </w:pPr>
+            <w:r>
+              <w:t>Успішно</w:t>
+            </w:r>
+          </w:p>
+        </w:tc>
+      </w:tr>
+      <w:tr>
+        <w:tc>
+          <w:tcPr>
+            <w:tcW w:type="dxa" w:w="2493"/>
+            <w:tcMar>
+              <w:top w:w="40" w:type="dxa"/>
+              <w:start w:w="90" w:type="dxa"/>
+              <w:bottom w:w="40" w:type="dxa"/>
+              <w:end w:w="90" w:type="dxa"/>
+            </w:tcMar>
+          </w:tcPr>
+          <w:p>
+            <w:pPr>
+              <w:spacing w:before="0" w:after="0" w:line="240" w:lineRule="auto"/>
+              <w:ind w:firstLine="0"/>
+            </w:pPr>
+            <w:r>
+              <w:t>Фільтр за категорією (GET /terms/?category=...)</w:t>
+            </w:r>
+          </w:p>
+        </w:tc>
+        <w:tc>
+          <w:tcPr>
+            <w:tcW w:type="dxa" w:w="2493"/>
+            <w:tcMar>
+              <w:top w:w="40" w:type="dxa"/>
+              <w:start w:w="90" w:type="dxa"/>
+              <w:bottom w:w="40" w:type="dxa"/>
+              <w:end w:w="90" w:type="dxa"/>
+            </w:tcMar>
+          </w:tcPr>
+          <w:p>
+            <w:pPr>
+              <w:spacing w:before="0" w:after="0" w:line="240" w:lineRule="auto"/>
+              <w:ind w:firstLine="0"/>
+            </w:pPr>
+            <w:r>
+              <w:t>Список термінів обмежено обраною категорією</w:t>
+            </w:r>
+          </w:p>
+        </w:tc>
+        <w:tc>
+          <w:tcPr>
+            <w:tcW w:type="dxa" w:w="2493"/>
+            <w:tcMar>
+              <w:top w:w="40" w:type="dxa"/>
+              <w:start w:w="90" w:type="dxa"/>
+              <w:bottom w:w="40" w:type="dxa"/>
+              <w:end w:w="90" w:type="dxa"/>
+            </w:tcMar>
+          </w:tcPr>
+          <w:p>
+            <w:pPr>
+              <w:spacing w:before="0" w:after="0" w:line="240" w:lineRule="auto"/>
+              <w:ind w:firstLine="0"/>
+            </w:pPr>
+            <w:r>
+              <w:t>Фільтрація за slug категорії коректна</w:t>
+            </w:r>
+          </w:p>
+        </w:tc>
+        <w:tc>
+          <w:tcPr>
+            <w:tcW w:type="dxa" w:w="2493"/>
+            <w:tcMar>
+              <w:top w:w="40" w:type="dxa"/>
+              <w:start w:w="90" w:type="dxa"/>
+              <w:bottom w:w="40" w:type="dxa"/>
+              <w:end w:w="90" w:type="dxa"/>
+            </w:tcMar>
+          </w:tcPr>
+          <w:p>
+            <w:pPr>
+              <w:spacing w:before="0" w:after="0" w:line="240" w:lineRule="auto"/>
+              <w:ind w:firstLine="0"/>
+            </w:pPr>
+            <w:r>
+              <w:t>Успішно</w:t>
+            </w:r>
+          </w:p>
+        </w:tc>
+      </w:tr>
+      <w:tr>
+        <w:tc>
+          <w:tcPr>
+            <w:tcW w:type="dxa" w:w="2493"/>
+            <w:tcMar>
+              <w:top w:w="40" w:type="dxa"/>
+              <w:start w:w="90" w:type="dxa"/>
+              <w:bottom w:w="40" w:type="dxa"/>
+              <w:end w:w="90" w:type="dxa"/>
+            </w:tcMar>
+          </w:tcPr>
+          <w:p>
+            <w:pPr>
+              <w:spacing w:before="0" w:after="0" w:line="240" w:lineRule="auto"/>
+              <w:ind w:firstLine="0"/>
+            </w:pPr>
+            <w:r>
+              <w:t>Картка терміна (GET /terms/&lt;slug&gt;/)</w:t>
+            </w:r>
+          </w:p>
+        </w:tc>
+        <w:tc>
+          <w:tcPr>
+            <w:tcW w:type="dxa" w:w="2493"/>
+            <w:tcMar>
+              <w:top w:w="40" w:type="dxa"/>
+              <w:start w:w="90" w:type="dxa"/>
+              <w:bottom w:w="40" w:type="dxa"/>
+              <w:end w:w="90" w:type="dxa"/>
+            </w:tcMar>
+          </w:tcPr>
+          <w:p>
+            <w:pPr>
+              <w:spacing w:before="0" w:after="0" w:line="240" w:lineRule="auto"/>
+              <w:ind w:firstLine="0"/>
+            </w:pPr>
+            <w:r>
+              <w:t>HTTP 200, відображення повного визначення</w:t>
+            </w:r>
+          </w:p>
+        </w:tc>
+        <w:tc>
+          <w:tcPr>
+            <w:tcW w:type="dxa" w:w="2493"/>
+            <w:tcMar>
+              <w:top w:w="40" w:type="dxa"/>
+              <w:start w:w="90" w:type="dxa"/>
+              <w:bottom w:w="40" w:type="dxa"/>
+              <w:end w:w="90" w:type="dxa"/>
+            </w:tcMar>
+          </w:tcPr>
+          <w:p>
+            <w:pPr>
+              <w:spacing w:before="0" w:after="0" w:line="240" w:lineRule="auto"/>
+              <w:ind w:firstLine="0"/>
+            </w:pPr>
+            <w:r>
+              <w:t>Контекст і шаблон картки коректні</w:t>
+            </w:r>
+          </w:p>
+        </w:tc>
+        <w:tc>
+          <w:tcPr>
+            <w:tcW w:type="dxa" w:w="2493"/>
+            <w:tcMar>
+              <w:top w:w="40" w:type="dxa"/>
+              <w:start w:w="90" w:type="dxa"/>
+              <w:bottom w:w="40" w:type="dxa"/>
+              <w:end w:w="90" w:type="dxa"/>
+            </w:tcMar>
+          </w:tcPr>
+          <w:p>
+            <w:pPr>
+              <w:spacing w:before="0" w:after="0" w:line="240" w:lineRule="auto"/>
+              <w:ind w:firstLine="0"/>
+            </w:pPr>
+            <w:r>
+              <w:t>Успішно</w:t>
+            </w:r>
+          </w:p>
+        </w:tc>
+      </w:tr>
+      <w:tr>
+        <w:tc>
+          <w:tcPr>
+            <w:tcW w:type="dxa" w:w="2493"/>
+            <w:tcMar>
+              <w:top w:w="40" w:type="dxa"/>
+              <w:start w:w="90" w:type="dxa"/>
+              <w:bottom w:w="40" w:type="dxa"/>
+              <w:end w:w="90" w:type="dxa"/>
+            </w:tcMar>
+          </w:tcPr>
+          <w:p>
+            <w:pPr>
+              <w:spacing w:before="0" w:after="0" w:line="240" w:lineRule="auto"/>
+              <w:ind w:firstLine="0"/>
+            </w:pPr>
+            <w:r>
+              <w:t>Надсилання пропозиції (POST /suggest/)</w:t>
+            </w:r>
+          </w:p>
+        </w:tc>
+        <w:tc>
+          <w:tcPr>
+            <w:tcW w:type="dxa" w:w="2493"/>
+            <w:tcMar>
+              <w:top w:w="40" w:type="dxa"/>
+              <w:start w:w="90" w:type="dxa"/>
+              <w:bottom w:w="40" w:type="dxa"/>
+              <w:end w:w="90" w:type="dxa"/>
+            </w:tcMar>
+          </w:tcPr>
+          <w:p>
+            <w:pPr>
+              <w:spacing w:before="0" w:after="0" w:line="240" w:lineRule="auto"/>
+              <w:ind w:firstLine="0"/>
+            </w:pPr>
+            <w:r>
+              <w:t>Створення запису UserSuggestion або повернення помилок валідації</w:t>
+            </w:r>
+          </w:p>
+        </w:tc>
+        <w:tc>
+          <w:tcPr>
+            <w:tcW w:type="dxa" w:w="2493"/>
+            <w:tcMar>
+              <w:top w:w="40" w:type="dxa"/>
+              <w:start w:w="90" w:type="dxa"/>
+              <w:bottom w:w="40" w:type="dxa"/>
+              <w:end w:w="90" w:type="dxa"/>
+            </w:tcMar>
+          </w:tcPr>
+          <w:p>
+            <w:pPr>
+              <w:spacing w:before="0" w:after="0" w:line="240" w:lineRule="auto"/>
+              <w:ind w:firstLine="0"/>
+            </w:pPr>
+            <w:r>
+              <w:t>Форма зберігає валідні дані, валідація спрацьовує</w:t>
+            </w:r>
+          </w:p>
+        </w:tc>
+        <w:tc>
+          <w:tcPr>
+            <w:tcW w:type="dxa" w:w="2493"/>
+            <w:tcMar>
+              <w:top w:w="40" w:type="dxa"/>
+              <w:start w:w="90" w:type="dxa"/>
+              <w:bottom w:w="40" w:type="dxa"/>
+              <w:end w:w="90" w:type="dxa"/>
+            </w:tcMar>
+          </w:tcPr>
+          <w:p>
+            <w:pPr>
+              <w:spacing w:before="0" w:after="0" w:line="240" w:lineRule="auto"/>
+              <w:ind w:firstLine="0"/>
+            </w:pPr>
+            <w:r>
+              <w:t>Успішно</w:t>
+            </w:r>
+          </w:p>
+        </w:tc>
+      </w:tr>
+      <w:tr>
+        <w:tc>
+          <w:tcPr>
+            <w:tcW w:type="dxa" w:w="2493"/>
+            <w:tcMar>
+              <w:top w:w="40" w:type="dxa"/>
+              <w:start w:w="90" w:type="dxa"/>
+              <w:bottom w:w="40" w:type="dxa"/>
+              <w:end w:w="90" w:type="dxa"/>
+            </w:tcMar>
+          </w:tcPr>
+          <w:p>
+            <w:pPr>
+              <w:spacing w:before="0" w:after="0" w:line="240" w:lineRule="auto"/>
+              <w:ind w:firstLine="0"/>
+            </w:pPr>
+            <w:r>
+              <w:t>Адміністративна підсистема (Django Admin)</w:t>
+            </w:r>
+          </w:p>
+        </w:tc>
+        <w:tc>
+          <w:tcPr>
+            <w:tcW w:type="dxa" w:w="2493"/>
+            <w:tcMar>
+              <w:top w:w="40" w:type="dxa"/>
+              <w:start w:w="90" w:type="dxa"/>
+              <w:bottom w:w="40" w:type="dxa"/>
+              <w:end w:w="90" w:type="dxa"/>
+            </w:tcMar>
+          </w:tcPr>
+          <w:p>
+            <w:pPr>
+              <w:spacing w:before="0" w:after="0" w:line="240" w:lineRule="auto"/>
+              <w:ind w:firstLine="0"/>
+            </w:pPr>
+            <w:r>
+              <w:t>Доступ до модерації та CRUD сутностей у штатному режимі</w:t>
+            </w:r>
+          </w:p>
+        </w:tc>
+        <w:tc>
+          <w:tcPr>
+            <w:tcW w:type="dxa" w:w="2493"/>
+            <w:tcMar>
+              <w:top w:w="40" w:type="dxa"/>
+              <w:start w:w="90" w:type="dxa"/>
+              <w:bottom w:w="40" w:type="dxa"/>
+              <w:end w:w="90" w:type="dxa"/>
+            </w:tcMar>
+          </w:tcPr>
+          <w:p>
+            <w:pPr>
+              <w:spacing w:before="0" w:after="0" w:line="240" w:lineRule="auto"/>
+              <w:ind w:firstLine="0"/>
+            </w:pPr>
+            <w:r>
+              <w:t>Моделі зареєстровані, списки й пошук доступні</w:t>
+            </w:r>
+          </w:p>
+        </w:tc>
+        <w:tc>
+          <w:tcPr>
+            <w:tcW w:type="dxa" w:w="2493"/>
+            <w:tcMar>
+              <w:top w:w="40" w:type="dxa"/>
+              <w:start w:w="90" w:type="dxa"/>
+              <w:bottom w:w="40" w:type="dxa"/>
+              <w:end w:w="90" w:type="dxa"/>
+            </w:tcMar>
+          </w:tcPr>
+          <w:p>
+            <w:pPr>
+              <w:spacing w:before="0" w:after="0" w:line="240" w:lineRule="auto"/>
+              <w:ind w:firstLine="0"/>
+            </w:pPr>
+            <w:r>
+              <w:t>Успішно</w:t>
+            </w:r>
+          </w:p>
+        </w:tc>
+      </w:tr>
+    </w:tbl>
     <w:p>
+      <w:pPr>
+        <w:ind w:firstLine="0"/>
+      </w:pPr>
       <w:r>
-        <w:t>Усі тестові сценарії виконані успішно, критичні помилки відсутні.</w:t>
+        <w:t>Усі базові сценарії виконано успішно; критичних помилок не виявлено. Розширення нефункціональних перевірок (навантаження, повне покриття edge-case) залишено для наступних ітерацій розвитку проєкту.</w:t>
       </w:r>
     </w:p>
     <w:sectPr>

</xml_diff>